<commit_message>
nmv 09 08 2026
</commit_message>
<xml_diff>
--- a/TS Jatai Ghanam Project/TS 2.5/TS 2.5 Jatai Malayalam Corrections.docx
+++ b/TS Jatai Ghanam Project/TS 2.5/TS 2.5 Jatai Malayalam Corrections.docx
@@ -1,6 +1,6 @@
 
 <file path=word/document.xml><?xml version="1.0" encoding="utf-8"?>
-<w:document xmlns:wpc="http://schemas.microsoft.com/office/word/2010/wordprocessingCanvas" xmlns:cx="http://schemas.microsoft.com/office/drawing/2014/chartex" xmlns:cx1="http://schemas.microsoft.com/office/drawing/2015/9/8/chartex" xmlns:cx2="http://schemas.microsoft.com/office/drawing/2015/10/21/chartex" xmlns:cx3="http://schemas.microsoft.com/office/drawing/2016/5/9/chartex" xmlns:cx4="http://schemas.microsoft.com/office/drawing/2016/5/10/chartex" xmlns:cx5="http://schemas.microsoft.com/office/drawing/2016/5/11/chartex" xmlns:cx6="http://schemas.microsoft.com/office/drawing/2016/5/12/chartex" xmlns:cx7="http://schemas.microsoft.com/office/drawing/2016/5/13/chartex" xmlns:cx8="http://schemas.microsoft.com/office/drawing/2016/5/14/chartex" xmlns:mc="http://schemas.openxmlformats.org/markup-compatibility/2006" xmlns:aink="http://schemas.microsoft.com/office/drawing/2016/ink" xmlns:am3d="http://schemas.microsoft.com/office/drawing/2017/model3d" xmlns:o="urn:schemas-microsoft-com:office:office" xmlns:oel="http://schemas.microsoft.com/office/2019/extlst" xmlns:r="http://schemas.openxmlformats.org/officeDocument/2006/relationships" xmlns:m="http://schemas.openxmlformats.org/officeDocument/2006/math" xmlns:v="urn:schemas-microsoft-com:vml" xmlns:wp14="http://schemas.microsoft.com/office/word/2010/wordprocessingDrawing" xmlns:wp="http://schemas.openxmlformats.org/drawingml/2006/wordprocessingDrawing" xmlns:w10="urn:schemas-microsoft-com:office:word" xmlns:w="http://schemas.openxmlformats.org/wordprocessingml/2006/main" xmlns:w14="http://schemas.microsoft.com/office/word/2010/wordml" xmlns:w15="http://schemas.microsoft.com/office/word/2012/wordml" xmlns:w16cex="http://schemas.microsoft.com/office/word/2018/wordml/cex" xmlns:w16cid="http://schemas.microsoft.com/office/word/2016/wordml/cid" xmlns:w16="http://schemas.microsoft.com/office/word/2018/wordml" xmlns:w16du="http://schemas.microsoft.com/office/word/2023/wordml/word16du" xmlns:w16sdtdh="http://schemas.microsoft.com/office/word/2020/wordml/sdtdatahash" xmlns:w16sdtfl="http://schemas.microsoft.com/office/word/2024/wordml/sdtformatlock" xmlns:w16se="http://schemas.microsoft.com/office/word/2015/wordml/symex" xmlns:wpg="http://schemas.microsoft.com/office/word/2010/wordprocessingGroup" xmlns:wpi="http://schemas.microsoft.com/office/word/2010/wordprocessingInk" xmlns:wne="http://schemas.microsoft.com/office/word/2006/wordml" xmlns:wps="http://schemas.microsoft.com/office/word/2010/wordprocessingShape" mc:Ignorable="w14 w15 w16se w16cid w16 w16cex w16sdtdh w16sdtfl w16du wp14">
+<w:document xmlns:wpc="http://schemas.microsoft.com/office/word/2010/wordprocessingCanvas" xmlns:cx="http://schemas.microsoft.com/office/drawing/2014/chartex" xmlns:cx1="http://schemas.microsoft.com/office/drawing/2015/9/8/chartex" xmlns:cx2="http://schemas.microsoft.com/office/drawing/2015/10/21/chartex" xmlns:cx3="http://schemas.microsoft.com/office/drawing/2016/5/9/chartex" xmlns:cx4="http://schemas.microsoft.com/office/drawing/2016/5/10/chartex" xmlns:cx5="http://schemas.microsoft.com/office/drawing/2016/5/11/chartex" xmlns:cx6="http://schemas.microsoft.com/office/drawing/2016/5/12/chartex" xmlns:cx7="http://schemas.microsoft.com/office/drawing/2016/5/13/chartex" xmlns:cx8="http://schemas.microsoft.com/office/drawing/2016/5/14/chartex" xmlns:mc="http://schemas.openxmlformats.org/markup-compatibility/2006" xmlns:aink="http://schemas.microsoft.com/office/drawing/2016/ink" xmlns:am3d="http://schemas.microsoft.com/office/drawing/2017/model3d" xmlns:o="urn:schemas-microsoft-com:office:office" xmlns:oel="http://schemas.microsoft.com/office/2019/extlst" xmlns:r="http://schemas.openxmlformats.org/officeDocument/2006/relationships" xmlns:m="http://schemas.openxmlformats.org/officeDocument/2006/math" xmlns:v="urn:schemas-microsoft-com:vml" xmlns:wp14="http://schemas.microsoft.com/office/word/2010/wordprocessingDrawing" xmlns:wp="http://schemas.openxmlformats.org/drawingml/2006/wordprocessingDrawing" xmlns:w10="urn:schemas-microsoft-com:office:word" xmlns:w="http://schemas.openxmlformats.org/wordprocessingml/2006/main" xmlns:w14="http://schemas.microsoft.com/office/word/2010/wordml" xmlns:w15="http://schemas.microsoft.com/office/word/2012/wordml" xmlns:w16cei="http://schemas.microsoft.com/office/word/2026/wordml/cei" xmlns:w16cex="http://schemas.microsoft.com/office/word/2018/wordml/cex" xmlns:w16cid="http://schemas.microsoft.com/office/word/2016/wordml/cid" xmlns:w16="http://schemas.microsoft.com/office/word/2018/wordml" xmlns:w16du="http://schemas.microsoft.com/office/word/2023/wordml/word16du" xmlns:w16sdtdh="http://schemas.microsoft.com/office/word/2020/wordml/sdtdatahash" xmlns:w16sdtfl="http://schemas.microsoft.com/office/word/2024/wordml/sdtformatlock" xmlns:w16se="http://schemas.microsoft.com/office/word/2015/wordml/symex" xmlns:wpg="http://schemas.microsoft.com/office/word/2010/wordprocessingGroup" xmlns:wpi="http://schemas.microsoft.com/office/word/2010/wordprocessingInk" xmlns:wne="http://schemas.microsoft.com/office/word/2006/wordml" xmlns:wps="http://schemas.microsoft.com/office/word/2010/wordprocessingShape" mc:Ignorable="w14 w15 w16se w16cid w16 w16cex w16sdtdh w16sdtfl w16du wp14">
   <w:body>
     <w:p>
       <w:pPr>
@@ -50,10 +50,9 @@
           <w:bCs/>
           <w:sz w:val="32"/>
           <w:szCs w:val="32"/>
-          <w:highlight w:val="red"/>
           <w:u w:val="single"/>
         </w:rPr>
-        <w:t>??????</w:t>
+        <w:t>31st July 2026</w:t>
       </w:r>
     </w:p>
     <w:p>
@@ -285,8 +284,19 @@
                 <w:sz w:val="32"/>
                 <w:szCs w:val="40"/>
               </w:rPr>
-              <w:t>)-  ey</w:t>
-            </w:r>
+              <w:t>)</w:t>
+            </w:r>
+            <w:proofErr w:type="gramStart"/>
+            <w:r>
+              <w:rPr>
+                <w:rFonts w:ascii="BRH Malayalam Extra" w:hAnsi="BRH Malayalam Extra" w:cs="BRH Malayalam Extra"/>
+                <w:color w:val="000000"/>
+                <w:sz w:val="32"/>
+                <w:szCs w:val="40"/>
+              </w:rPr>
+              <w:t>-  ey</w:t>
+            </w:r>
+            <w:proofErr w:type="gramEnd"/>
             <w:r>
               <w:rPr>
                 <w:rFonts w:ascii="BRH Malayalam Extra" w:hAnsi="BRH Malayalam Extra" w:cs="BRH Malayalam Extra"/>
@@ -539,8 +549,19 @@
                 <w:sz w:val="32"/>
                 <w:szCs w:val="40"/>
               </w:rPr>
-              <w:t>)-  ey</w:t>
-            </w:r>
+              <w:t>)</w:t>
+            </w:r>
+            <w:proofErr w:type="gramStart"/>
+            <w:r>
+              <w:rPr>
+                <w:rFonts w:ascii="BRH Malayalam Extra" w:hAnsi="BRH Malayalam Extra" w:cs="BRH Malayalam Extra"/>
+                <w:color w:val="000000"/>
+                <w:sz w:val="32"/>
+                <w:szCs w:val="40"/>
+              </w:rPr>
+              <w:t>-  ey</w:t>
+            </w:r>
+            <w:proofErr w:type="gramEnd"/>
             <w:r>
               <w:rPr>
                 <w:rFonts w:ascii="BRH Malayalam Extra" w:hAnsi="BRH Malayalam Extra" w:cs="BRH Malayalam Extra"/>
@@ -681,61 +702,6 @@
               </w:rPr>
               <w:t xml:space="preserve"> CZy— eye¥Z | </w:t>
             </w:r>
-          </w:p>
-        </w:tc>
-      </w:tr>
-      <w:tr>
-        <w:trPr>
-          <w:trHeight w:val="1121"/>
-        </w:trPr>
-        <w:tc>
-          <w:tcPr>
-            <w:tcW w:w="7514" w:type="dxa"/>
-            <w:tcBorders>
-              <w:top w:val="single" w:sz="4" w:space="0" w:color="000000"/>
-              <w:left w:val="single" w:sz="4" w:space="0" w:color="000000"/>
-              <w:bottom w:val="single" w:sz="4" w:space="0" w:color="000000"/>
-              <w:right w:val="single" w:sz="4" w:space="0" w:color="000000"/>
-            </w:tcBorders>
-          </w:tcPr>
-          <w:p>
-            <w:pPr>
-              <w:widowControl w:val="0"/>
-              <w:autoSpaceDE w:val="0"/>
-              <w:autoSpaceDN w:val="0"/>
-              <w:adjustRightInd w:val="0"/>
-              <w:spacing w:before="0" w:line="240" w:lineRule="auto"/>
-              <w:rPr>
-                <w:rFonts w:cs="BRH Malayalam Extra"/>
-                <w:color w:val="000000"/>
-                <w:szCs w:val="40"/>
-              </w:rPr>
-            </w:pPr>
-          </w:p>
-        </w:tc>
-        <w:tc>
-          <w:tcPr>
-            <w:tcW w:w="7371" w:type="dxa"/>
-            <w:tcBorders>
-              <w:top w:val="single" w:sz="4" w:space="0" w:color="000000"/>
-              <w:left w:val="single" w:sz="4" w:space="0" w:color="000000"/>
-              <w:bottom w:val="single" w:sz="4" w:space="0" w:color="000000"/>
-              <w:right w:val="single" w:sz="4" w:space="0" w:color="000000"/>
-            </w:tcBorders>
-          </w:tcPr>
-          <w:p>
-            <w:pPr>
-              <w:widowControl w:val="0"/>
-              <w:autoSpaceDE w:val="0"/>
-              <w:autoSpaceDN w:val="0"/>
-              <w:adjustRightInd w:val="0"/>
-              <w:spacing w:before="0" w:line="240" w:lineRule="auto"/>
-              <w:rPr>
-                <w:rFonts w:cs="BRH Malayalam Extra"/>
-                <w:color w:val="000000"/>
-                <w:szCs w:val="40"/>
-              </w:rPr>
-            </w:pPr>
           </w:p>
         </w:tc>
       </w:tr>
@@ -752,11 +718,7 @@
           <w:u w:val="single"/>
         </w:rPr>
       </w:pPr>
-    </w:p>
-    <w:p>
-      <w:pPr>
-        <w:spacing w:before="0" w:line="240" w:lineRule="auto"/>
-        <w:jc w:val="center"/>
+      <w:r>
         <w:rPr>
           <w:b/>
           <w:bCs/>
@@ -764,20 +726,8 @@
           <w:szCs w:val="32"/>
           <w:u w:val="single"/>
         </w:rPr>
-      </w:pPr>
-    </w:p>
-    <w:p>
-      <w:pPr>
-        <w:spacing w:before="0" w:line="240" w:lineRule="auto"/>
-        <w:jc w:val="center"/>
-        <w:rPr>
-          <w:b/>
-          <w:bCs/>
-          <w:sz w:val="32"/>
-          <w:szCs w:val="32"/>
-          <w:u w:val="single"/>
-        </w:rPr>
-      </w:pPr>
+        <w:t>==============</w:t>
+      </w:r>
     </w:p>
     <w:p>
       <w:pPr>
@@ -1105,8 +1055,19 @@
                 <w:sz w:val="32"/>
                 <w:szCs w:val="40"/>
               </w:rPr>
-              <w:t>)-  G</w:t>
-            </w:r>
+              <w:t>)</w:t>
+            </w:r>
+            <w:proofErr w:type="gramStart"/>
+            <w:r>
+              <w:rPr>
+                <w:rFonts w:ascii="BRH Malayalam Extra" w:hAnsi="BRH Malayalam Extra" w:cs="BRH Malayalam Extra"/>
+                <w:color w:val="000000"/>
+                <w:sz w:val="32"/>
+                <w:szCs w:val="40"/>
+              </w:rPr>
+              <w:t>-  G</w:t>
+            </w:r>
+            <w:proofErr w:type="gramEnd"/>
             <w:r>
               <w:rPr>
                 <w:rFonts w:ascii="BRH Malayalam Extra" w:hAnsi="BRH Malayalam Extra" w:cs="BRH Malayalam Extra"/>
@@ -1503,8 +1464,19 @@
                 <w:sz w:val="32"/>
                 <w:szCs w:val="40"/>
               </w:rPr>
-              <w:t>)-  G</w:t>
-            </w:r>
+              <w:t>)</w:t>
+            </w:r>
+            <w:proofErr w:type="gramStart"/>
+            <w:r>
+              <w:rPr>
+                <w:rFonts w:ascii="BRH Malayalam Extra" w:hAnsi="BRH Malayalam Extra" w:cs="BRH Malayalam Extra"/>
+                <w:color w:val="000000"/>
+                <w:sz w:val="32"/>
+                <w:szCs w:val="40"/>
+              </w:rPr>
+              <w:t>-  G</w:t>
+            </w:r>
+            <w:proofErr w:type="gramEnd"/>
             <w:r>
               <w:rPr>
                 <w:rFonts w:ascii="BRH Malayalam Extra" w:hAnsi="BRH Malayalam Extra" w:cs="BRH Malayalam Extra"/>
@@ -1930,8 +1902,19 @@
                 <w:sz w:val="32"/>
                 <w:szCs w:val="40"/>
               </w:rPr>
-              <w:t>)-  öex</w:t>
-            </w:r>
+              <w:t>)</w:t>
+            </w:r>
+            <w:proofErr w:type="gramStart"/>
+            <w:r>
+              <w:rPr>
+                <w:rFonts w:ascii="BRH Malayalam Extra" w:hAnsi="BRH Malayalam Extra" w:cs="BRH Malayalam Extra"/>
+                <w:color w:val="000000"/>
+                <w:sz w:val="32"/>
+                <w:szCs w:val="40"/>
+              </w:rPr>
+              <w:t>-  öex</w:t>
+            </w:r>
+            <w:proofErr w:type="gramEnd"/>
             <w:r>
               <w:rPr>
                 <w:rFonts w:ascii="BRH Malayalam Extra" w:hAnsi="BRH Malayalam Extra" w:cs="BRH Malayalam Extra"/>
@@ -2235,8 +2218,19 @@
                 <w:sz w:val="32"/>
                 <w:szCs w:val="40"/>
               </w:rPr>
-              <w:t>)-  öex</w:t>
-            </w:r>
+              <w:t>)</w:t>
+            </w:r>
+            <w:proofErr w:type="gramStart"/>
+            <w:r>
+              <w:rPr>
+                <w:rFonts w:ascii="BRH Malayalam Extra" w:hAnsi="BRH Malayalam Extra" w:cs="BRH Malayalam Extra"/>
+                <w:color w:val="000000"/>
+                <w:sz w:val="32"/>
+                <w:szCs w:val="40"/>
+              </w:rPr>
+              <w:t>-  öex</w:t>
+            </w:r>
+            <w:proofErr w:type="gramEnd"/>
             <w:r>
               <w:rPr>
                 <w:rFonts w:ascii="BRH Malayalam Extra" w:hAnsi="BRH Malayalam Extra" w:cs="BRH Malayalam Extra"/>
@@ -2442,7 +2436,6 @@
                 <w:color w:val="000000"/>
                 <w:szCs w:val="40"/>
               </w:rPr>
-              <w:lastRenderedPageBreak/>
               <w:t>37</w:t>
             </w:r>
             <w:r>
@@ -2546,7 +2539,27 @@
                 <w:sz w:val="32"/>
                 <w:szCs w:val="40"/>
               </w:rPr>
-              <w:t>)-  Kû—¤¤mJ | kx</w:t>
+              <w:t>)</w:t>
+            </w:r>
+            <w:proofErr w:type="gramStart"/>
+            <w:r>
+              <w:rPr>
+                <w:rFonts w:ascii="BRH Malayalam Extra" w:hAnsi="BRH Malayalam Extra" w:cs="BRH Malayalam Extra"/>
+                <w:color w:val="000000"/>
+                <w:sz w:val="32"/>
+                <w:szCs w:val="40"/>
+              </w:rPr>
+              <w:t>-  Kû</w:t>
+            </w:r>
+            <w:proofErr w:type="gramEnd"/>
+            <w:r>
+              <w:rPr>
+                <w:rFonts w:ascii="BRH Malayalam Extra" w:hAnsi="BRH Malayalam Extra" w:cs="BRH Malayalam Extra"/>
+                <w:color w:val="000000"/>
+                <w:sz w:val="32"/>
+                <w:szCs w:val="40"/>
+              </w:rPr>
+              <w:t>—¤¤mJ | kx</w:t>
             </w:r>
             <w:r>
               <w:rPr>
@@ -2881,7 +2894,27 @@
                 <w:sz w:val="32"/>
                 <w:szCs w:val="40"/>
               </w:rPr>
-              <w:t>)-  Kû—¤¤mJ | kx</w:t>
+              <w:t>)</w:t>
+            </w:r>
+            <w:proofErr w:type="gramStart"/>
+            <w:r>
+              <w:rPr>
+                <w:rFonts w:ascii="BRH Malayalam Extra" w:hAnsi="BRH Malayalam Extra" w:cs="BRH Malayalam Extra"/>
+                <w:color w:val="000000"/>
+                <w:sz w:val="32"/>
+                <w:szCs w:val="40"/>
+              </w:rPr>
+              <w:t>-  Kû</w:t>
+            </w:r>
+            <w:proofErr w:type="gramEnd"/>
+            <w:r>
+              <w:rPr>
+                <w:rFonts w:ascii="BRH Malayalam Extra" w:hAnsi="BRH Malayalam Extra" w:cs="BRH Malayalam Extra"/>
+                <w:color w:val="000000"/>
+                <w:sz w:val="32"/>
+                <w:szCs w:val="40"/>
+              </w:rPr>
+              <w:t>—¤¤mJ | kx</w:t>
             </w:r>
             <w:r>
               <w:rPr>
@@ -3118,6 +3151,7 @@
                 <w:color w:val="000000"/>
                 <w:szCs w:val="40"/>
               </w:rPr>
+              <w:lastRenderedPageBreak/>
               <w:t>46</w:t>
             </w:r>
             <w:r>
@@ -3221,8 +3255,19 @@
                 <w:sz w:val="32"/>
                 <w:szCs w:val="40"/>
               </w:rPr>
-              <w:t>)-  j</w:t>
-            </w:r>
+              <w:t>)</w:t>
+            </w:r>
+            <w:proofErr w:type="gramStart"/>
+            <w:r>
+              <w:rPr>
+                <w:rFonts w:ascii="BRH Malayalam Extra" w:hAnsi="BRH Malayalam Extra" w:cs="BRH Malayalam Extra"/>
+                <w:color w:val="000000"/>
+                <w:sz w:val="32"/>
+                <w:szCs w:val="40"/>
+              </w:rPr>
+              <w:t>-  j</w:t>
+            </w:r>
+            <w:proofErr w:type="gramEnd"/>
             <w:r>
               <w:rPr>
                 <w:rFonts w:ascii="BRH Malayalam Extra" w:hAnsi="BRH Malayalam Extra" w:cs="BRH Malayalam Extra"/>
@@ -3592,7 +3637,17 @@
                 <w:sz w:val="32"/>
                 <w:szCs w:val="40"/>
               </w:rPr>
-              <w:t>)-  qûJ</w:t>
+              <w:t>)</w:t>
+            </w:r>
+            <w:proofErr w:type="gramStart"/>
+            <w:r>
+              <w:rPr>
+                <w:rFonts w:ascii="BRH Malayalam Extra" w:hAnsi="BRH Malayalam Extra" w:cs="BRH Malayalam Extra"/>
+                <w:color w:val="000000"/>
+                <w:sz w:val="32"/>
+                <w:szCs w:val="40"/>
+              </w:rPr>
+              <w:t>-  qûJ</w:t>
             </w:r>
             <w:r>
               <w:rPr>
@@ -3611,7 +3666,17 @@
                 <w:sz w:val="32"/>
                 <w:szCs w:val="40"/>
               </w:rPr>
-              <w:t>J | A</w:t>
+              <w:t>J</w:t>
+            </w:r>
+            <w:proofErr w:type="gramEnd"/>
+            <w:r>
+              <w:rPr>
+                <w:rFonts w:ascii="BRH Malayalam Extra" w:hAnsi="BRH Malayalam Extra" w:cs="BRH Malayalam Extra"/>
+                <w:color w:val="000000"/>
+                <w:sz w:val="32"/>
+                <w:szCs w:val="40"/>
+              </w:rPr>
+              <w:t xml:space="preserve"> | A</w:t>
             </w:r>
             <w:r>
               <w:rPr>
@@ -3834,14 +3899,24 @@
                 <w:sz w:val="32"/>
                 <w:szCs w:val="40"/>
               </w:rPr>
-              <w:t>)-  qûJ</w:t>
-            </w:r>
+              <w:t>)</w:t>
+            </w:r>
+            <w:proofErr w:type="gramStart"/>
             <w:r>
               <w:rPr>
                 <w:rFonts w:ascii="BRH Malayalam" w:hAnsi="BRH Malayalam" w:cs="BRH Malayalam"/>
                 <w:color w:val="000000"/>
                 <w:sz w:val="32"/>
                 <w:szCs w:val="40"/>
+              </w:rPr>
+              <w:t>-  qûJ</w:t>
+            </w:r>
+            <w:r>
+              <w:rPr>
+                <w:rFonts w:ascii="BRH Malayalam" w:hAnsi="BRH Malayalam" w:cs="BRH Malayalam"/>
+                <w:color w:val="000000"/>
+                <w:sz w:val="32"/>
+                <w:szCs w:val="40"/>
                 <w:highlight w:val="yellow"/>
               </w:rPr>
               <w:t>qû</w:t>
@@ -3853,7 +3928,17 @@
                 <w:sz w:val="32"/>
                 <w:szCs w:val="40"/>
               </w:rPr>
-              <w:t>J |</w:t>
+              <w:t>J</w:t>
+            </w:r>
+            <w:proofErr w:type="gramEnd"/>
+            <w:r>
+              <w:rPr>
+                <w:rFonts w:ascii="BRH Malayalam" w:hAnsi="BRH Malayalam" w:cs="BRH Malayalam"/>
+                <w:color w:val="000000"/>
+                <w:sz w:val="32"/>
+                <w:szCs w:val="40"/>
+              </w:rPr>
+              <w:t xml:space="preserve"> |</w:t>
             </w:r>
           </w:p>
           <w:p>
@@ -4067,8 +4152,19 @@
                 <w:sz w:val="32"/>
                 <w:szCs w:val="40"/>
               </w:rPr>
-              <w:t>)-  j</w:t>
-            </w:r>
+              <w:t>)</w:t>
+            </w:r>
+            <w:proofErr w:type="gramStart"/>
+            <w:r>
+              <w:rPr>
+                <w:rFonts w:ascii="BRH Malayalam Extra" w:hAnsi="BRH Malayalam Extra" w:cs="BRH Malayalam Extra"/>
+                <w:color w:val="000000"/>
+                <w:sz w:val="32"/>
+                <w:szCs w:val="40"/>
+              </w:rPr>
+              <w:t>-  j</w:t>
+            </w:r>
+            <w:proofErr w:type="gramEnd"/>
             <w:r>
               <w:rPr>
                 <w:rFonts w:ascii="BRH Malayalam Extra" w:hAnsi="BRH Malayalam Extra" w:cs="BRH Malayalam Extra"/>
@@ -4458,7 +4554,17 @@
                 <w:sz w:val="32"/>
                 <w:szCs w:val="40"/>
               </w:rPr>
-              <w:t>)-  qûJ</w:t>
+              <w:t>)</w:t>
+            </w:r>
+            <w:proofErr w:type="gramStart"/>
+            <w:r>
+              <w:rPr>
+                <w:rFonts w:ascii="BRH Malayalam Extra" w:hAnsi="BRH Malayalam Extra" w:cs="BRH Malayalam Extra"/>
+                <w:color w:val="000000"/>
+                <w:sz w:val="32"/>
+                <w:szCs w:val="40"/>
+              </w:rPr>
+              <w:t>-  qûJ</w:t>
             </w:r>
             <w:r>
               <w:rPr>
@@ -4468,7 +4574,18 @@
                 <w:szCs w:val="40"/>
                 <w:highlight w:val="green"/>
               </w:rPr>
-              <w:t>qû—J</w:t>
+              <w:t>qû</w:t>
+            </w:r>
+            <w:proofErr w:type="gramEnd"/>
+            <w:r>
+              <w:rPr>
+                <w:rFonts w:ascii="BRH Malayalam Extra" w:hAnsi="BRH Malayalam Extra" w:cs="BRH Malayalam Extra"/>
+                <w:color w:val="000000"/>
+                <w:sz w:val="32"/>
+                <w:szCs w:val="40"/>
+                <w:highlight w:val="green"/>
+              </w:rPr>
+              <w:t>—J</w:t>
             </w:r>
             <w:r>
               <w:rPr>
@@ -4709,18 +4826,29 @@
                 <w:sz w:val="32"/>
                 <w:szCs w:val="40"/>
               </w:rPr>
-              <w:t>)-  qûJ</w:t>
-            </w:r>
+              <w:t>)</w:t>
+            </w:r>
+            <w:proofErr w:type="gramStart"/>
             <w:r>
               <w:rPr>
                 <w:rFonts w:ascii="BRH Malayalam" w:hAnsi="BRH Malayalam" w:cs="BRH Malayalam"/>
                 <w:color w:val="000000"/>
                 <w:sz w:val="32"/>
                 <w:szCs w:val="40"/>
+              </w:rPr>
+              <w:t>-  qûJ</w:t>
+            </w:r>
+            <w:r>
+              <w:rPr>
+                <w:rFonts w:ascii="BRH Malayalam" w:hAnsi="BRH Malayalam" w:cs="BRH Malayalam"/>
+                <w:color w:val="000000"/>
+                <w:sz w:val="32"/>
+                <w:szCs w:val="40"/>
                 <w:highlight w:val="green"/>
               </w:rPr>
               <w:t>qû</w:t>
             </w:r>
+            <w:proofErr w:type="gramEnd"/>
             <w:r>
               <w:rPr>
                 <w:rFonts w:ascii="BRH Malayalam Extra" w:hAnsi="BRH Malayalam Extra" w:cs="BRH Malayalam Extra"/>
@@ -4954,8 +5082,19 @@
                 <w:sz w:val="32"/>
                 <w:szCs w:val="40"/>
               </w:rPr>
-              <w:t>)-  eõx</w:t>
-            </w:r>
+              <w:t>)</w:t>
+            </w:r>
+            <w:proofErr w:type="gramStart"/>
+            <w:r>
+              <w:rPr>
+                <w:rFonts w:ascii="BRH Malayalam Extra" w:hAnsi="BRH Malayalam Extra" w:cs="BRH Malayalam Extra"/>
+                <w:color w:val="000000"/>
+                <w:sz w:val="32"/>
+                <w:szCs w:val="40"/>
+              </w:rPr>
+              <w:t>-  eõx</w:t>
+            </w:r>
+            <w:proofErr w:type="gramEnd"/>
             <w:r>
               <w:rPr>
                 <w:rFonts w:ascii="BRH Malayalam Extra" w:hAnsi="BRH Malayalam Extra" w:cs="BRH Malayalam Extra"/>
@@ -5594,8 +5733,19 @@
                 <w:sz w:val="32"/>
                 <w:szCs w:val="40"/>
               </w:rPr>
-              <w:t>)-  sx</w:t>
-            </w:r>
+              <w:t>)</w:t>
+            </w:r>
+            <w:proofErr w:type="gramStart"/>
+            <w:r>
+              <w:rPr>
+                <w:rFonts w:ascii="BRH Malayalam Extra" w:hAnsi="BRH Malayalam Extra" w:cs="BRH Malayalam Extra"/>
+                <w:color w:val="000000"/>
+                <w:sz w:val="32"/>
+                <w:szCs w:val="40"/>
+              </w:rPr>
+              <w:t>-  sx</w:t>
+            </w:r>
+            <w:proofErr w:type="gramEnd"/>
             <w:r>
               <w:rPr>
                 <w:rFonts w:ascii="BRH Malayalam Extra" w:hAnsi="BRH Malayalam Extra" w:cs="BRH Malayalam Extra"/>
@@ -6052,7 +6202,6 @@
                 <w:szCs w:val="40"/>
                 <w:highlight w:val="yellow"/>
               </w:rPr>
-              <w:lastRenderedPageBreak/>
               <w:t>j</w:t>
             </w:r>
             <w:r>
@@ -6188,8 +6337,19 @@
                 <w:sz w:val="32"/>
                 <w:szCs w:val="40"/>
               </w:rPr>
-              <w:t>)-  sx</w:t>
-            </w:r>
+              <w:t>)</w:t>
+            </w:r>
+            <w:proofErr w:type="gramStart"/>
+            <w:r>
+              <w:rPr>
+                <w:rFonts w:ascii="BRH Malayalam Extra" w:hAnsi="BRH Malayalam Extra" w:cs="BRH Malayalam Extra"/>
+                <w:color w:val="000000"/>
+                <w:sz w:val="32"/>
+                <w:szCs w:val="40"/>
+              </w:rPr>
+              <w:t>-  sx</w:t>
+            </w:r>
+            <w:proofErr w:type="gramEnd"/>
             <w:r>
               <w:rPr>
                 <w:rFonts w:ascii="BRH Malayalam Extra" w:hAnsi="BRH Malayalam Extra" w:cs="BRH Malayalam Extra"/>
@@ -6486,7 +6646,6 @@
                 <w:color w:val="000000"/>
                 <w:szCs w:val="40"/>
               </w:rPr>
-              <w:lastRenderedPageBreak/>
               <w:t>16</w:t>
             </w:r>
             <w:r>
@@ -6590,8 +6749,19 @@
                 <w:sz w:val="32"/>
                 <w:szCs w:val="40"/>
               </w:rPr>
-              <w:t>)-  eõx</w:t>
-            </w:r>
+              <w:t>)</w:t>
+            </w:r>
+            <w:proofErr w:type="gramStart"/>
+            <w:r>
+              <w:rPr>
+                <w:rFonts w:ascii="BRH Malayalam Extra" w:hAnsi="BRH Malayalam Extra" w:cs="BRH Malayalam Extra"/>
+                <w:color w:val="000000"/>
+                <w:sz w:val="32"/>
+                <w:szCs w:val="40"/>
+              </w:rPr>
+              <w:t>-  eõx</w:t>
+            </w:r>
+            <w:proofErr w:type="gramEnd"/>
             <w:r>
               <w:rPr>
                 <w:rFonts w:ascii="BRH Malayalam Extra" w:hAnsi="BRH Malayalam Extra" w:cs="BRH Malayalam Extra"/>
@@ -7193,8 +7363,19 @@
                 <w:sz w:val="32"/>
                 <w:szCs w:val="40"/>
               </w:rPr>
-              <w:t>)-  sx</w:t>
-            </w:r>
+              <w:t>)</w:t>
+            </w:r>
+            <w:proofErr w:type="gramStart"/>
+            <w:r>
+              <w:rPr>
+                <w:rFonts w:ascii="BRH Malayalam Extra" w:hAnsi="BRH Malayalam Extra" w:cs="BRH Malayalam Extra"/>
+                <w:color w:val="000000"/>
+                <w:sz w:val="32"/>
+                <w:szCs w:val="40"/>
+              </w:rPr>
+              <w:t>-  sx</w:t>
+            </w:r>
+            <w:proofErr w:type="gramEnd"/>
             <w:r>
               <w:rPr>
                 <w:rFonts w:ascii="BRH Malayalam Extra" w:hAnsi="BRH Malayalam Extra" w:cs="BRH Malayalam Extra"/>
@@ -7614,7 +7795,6 @@
                 <w:szCs w:val="40"/>
                 <w:highlight w:val="green"/>
               </w:rPr>
-              <w:lastRenderedPageBreak/>
               <w:t>j</w:t>
             </w:r>
             <w:r>
@@ -7750,8 +7930,19 @@
                 <w:sz w:val="32"/>
                 <w:szCs w:val="40"/>
               </w:rPr>
-              <w:t>)-  sx</w:t>
-            </w:r>
+              <w:t>)</w:t>
+            </w:r>
+            <w:proofErr w:type="gramStart"/>
+            <w:r>
+              <w:rPr>
+                <w:rFonts w:ascii="BRH Malayalam Extra" w:hAnsi="BRH Malayalam Extra" w:cs="BRH Malayalam Extra"/>
+                <w:color w:val="000000"/>
+                <w:sz w:val="32"/>
+                <w:szCs w:val="40"/>
+              </w:rPr>
+              <w:t>-  sx</w:t>
+            </w:r>
+            <w:proofErr w:type="gramEnd"/>
             <w:r>
               <w:rPr>
                 <w:rFonts w:ascii="BRH Malayalam Extra" w:hAnsi="BRH Malayalam Extra" w:cs="BRH Malayalam Extra"/>
@@ -8145,7 +8336,27 @@
                 <w:sz w:val="32"/>
                 <w:szCs w:val="40"/>
               </w:rPr>
-              <w:t>)-  ¥Zrx˜I | ¤¤i</w:t>
+              <w:t>)</w:t>
+            </w:r>
+            <w:proofErr w:type="gramStart"/>
+            <w:r>
+              <w:rPr>
+                <w:rFonts w:ascii="BRH Malayalam Extra" w:hAnsi="BRH Malayalam Extra" w:cs="BRH Malayalam Extra"/>
+                <w:color w:val="000000"/>
+                <w:sz w:val="32"/>
+                <w:szCs w:val="40"/>
+              </w:rPr>
+              <w:t>-  ¥</w:t>
+            </w:r>
+            <w:proofErr w:type="gramEnd"/>
+            <w:r>
+              <w:rPr>
+                <w:rFonts w:ascii="BRH Malayalam Extra" w:hAnsi="BRH Malayalam Extra" w:cs="BRH Malayalam Extra"/>
+                <w:color w:val="000000"/>
+                <w:sz w:val="32"/>
+                <w:szCs w:val="40"/>
+              </w:rPr>
+              <w:t>Zrx˜I | ¤¤i</w:t>
             </w:r>
             <w:r>
               <w:rPr>
@@ -8518,7 +8729,27 @@
                 <w:sz w:val="32"/>
                 <w:szCs w:val="40"/>
               </w:rPr>
-              <w:t>)-  ¤¤i</w:t>
+              <w:t>)</w:t>
+            </w:r>
+            <w:proofErr w:type="gramStart"/>
+            <w:r>
+              <w:rPr>
+                <w:rFonts w:ascii="BRH Malayalam Extra" w:hAnsi="BRH Malayalam Extra" w:cs="BRH Malayalam Extra"/>
+                <w:color w:val="000000"/>
+                <w:sz w:val="32"/>
+                <w:szCs w:val="40"/>
+              </w:rPr>
+              <w:t>-  ¤</w:t>
+            </w:r>
+            <w:proofErr w:type="gramEnd"/>
+            <w:r>
+              <w:rPr>
+                <w:rFonts w:ascii="BRH Malayalam Extra" w:hAnsi="BRH Malayalam Extra" w:cs="BRH Malayalam Extra"/>
+                <w:color w:val="000000"/>
+                <w:sz w:val="32"/>
+                <w:szCs w:val="40"/>
+              </w:rPr>
+              <w:t>¤i</w:t>
             </w:r>
             <w:r>
               <w:rPr>
@@ -8986,7 +9217,27 @@
                 <w:sz w:val="32"/>
                 <w:szCs w:val="40"/>
               </w:rPr>
-              <w:t>)-  ¤¤i</w:t>
+              <w:t>)</w:t>
+            </w:r>
+            <w:proofErr w:type="gramStart"/>
+            <w:r>
+              <w:rPr>
+                <w:rFonts w:ascii="BRH Malayalam Extra" w:hAnsi="BRH Malayalam Extra" w:cs="BRH Malayalam Extra"/>
+                <w:color w:val="000000"/>
+                <w:sz w:val="32"/>
+                <w:szCs w:val="40"/>
+              </w:rPr>
+              <w:t>-  ¤</w:t>
+            </w:r>
+            <w:proofErr w:type="gramEnd"/>
+            <w:r>
+              <w:rPr>
+                <w:rFonts w:ascii="BRH Malayalam Extra" w:hAnsi="BRH Malayalam Extra" w:cs="BRH Malayalam Extra"/>
+                <w:color w:val="000000"/>
+                <w:sz w:val="32"/>
+                <w:szCs w:val="40"/>
+              </w:rPr>
+              <w:t>¤i</w:t>
             </w:r>
             <w:r>
               <w:rPr>
@@ -9325,7 +9576,27 @@
                 <w:sz w:val="32"/>
                 <w:szCs w:val="40"/>
               </w:rPr>
-              <w:t>)-  ¥Zrx˜I | ¤¤i</w:t>
+              <w:t>)</w:t>
+            </w:r>
+            <w:proofErr w:type="gramStart"/>
+            <w:r>
+              <w:rPr>
+                <w:rFonts w:ascii="BRH Malayalam Extra" w:hAnsi="BRH Malayalam Extra" w:cs="BRH Malayalam Extra"/>
+                <w:color w:val="000000"/>
+                <w:sz w:val="32"/>
+                <w:szCs w:val="40"/>
+              </w:rPr>
+              <w:t>-  ¥</w:t>
+            </w:r>
+            <w:proofErr w:type="gramEnd"/>
+            <w:r>
+              <w:rPr>
+                <w:rFonts w:ascii="BRH Malayalam Extra" w:hAnsi="BRH Malayalam Extra" w:cs="BRH Malayalam Extra"/>
+                <w:color w:val="000000"/>
+                <w:sz w:val="32"/>
+                <w:szCs w:val="40"/>
+              </w:rPr>
+              <w:t>Zrx˜I | ¤¤i</w:t>
             </w:r>
             <w:r>
               <w:rPr>
@@ -9678,7 +9949,27 @@
                 <w:sz w:val="32"/>
                 <w:szCs w:val="40"/>
               </w:rPr>
-              <w:t>)-  ¤¤i</w:t>
+              <w:t>)</w:t>
+            </w:r>
+            <w:proofErr w:type="gramStart"/>
+            <w:r>
+              <w:rPr>
+                <w:rFonts w:ascii="BRH Malayalam Extra" w:hAnsi="BRH Malayalam Extra" w:cs="BRH Malayalam Extra"/>
+                <w:color w:val="000000"/>
+                <w:sz w:val="32"/>
+                <w:szCs w:val="40"/>
+              </w:rPr>
+              <w:t>-  ¤</w:t>
+            </w:r>
+            <w:proofErr w:type="gramEnd"/>
+            <w:r>
+              <w:rPr>
+                <w:rFonts w:ascii="BRH Malayalam Extra" w:hAnsi="BRH Malayalam Extra" w:cs="BRH Malayalam Extra"/>
+                <w:color w:val="000000"/>
+                <w:sz w:val="32"/>
+                <w:szCs w:val="40"/>
+              </w:rPr>
+              <w:t>¤i</w:t>
             </w:r>
             <w:r>
               <w:rPr>
@@ -10120,7 +10411,27 @@
                 <w:sz w:val="32"/>
                 <w:szCs w:val="40"/>
               </w:rPr>
-              <w:t>)-  ¤¤i</w:t>
+              <w:t>)</w:t>
+            </w:r>
+            <w:proofErr w:type="gramStart"/>
+            <w:r>
+              <w:rPr>
+                <w:rFonts w:ascii="BRH Malayalam Extra" w:hAnsi="BRH Malayalam Extra" w:cs="BRH Malayalam Extra"/>
+                <w:color w:val="000000"/>
+                <w:sz w:val="32"/>
+                <w:szCs w:val="40"/>
+              </w:rPr>
+              <w:t>-  ¤</w:t>
+            </w:r>
+            <w:proofErr w:type="gramEnd"/>
+            <w:r>
+              <w:rPr>
+                <w:rFonts w:ascii="BRH Malayalam Extra" w:hAnsi="BRH Malayalam Extra" w:cs="BRH Malayalam Extra"/>
+                <w:color w:val="000000"/>
+                <w:sz w:val="32"/>
+                <w:szCs w:val="40"/>
+              </w:rPr>
+              <w:t>¤i</w:t>
             </w:r>
             <w:r>
               <w:rPr>
@@ -10929,7 +11240,6 @@
                 <w:szCs w:val="40"/>
                 <w:lang w:val="it-IT"/>
               </w:rPr>
-              <w:lastRenderedPageBreak/>
               <w:t>E¥r</w:t>
             </w:r>
             <w:r>
@@ -11109,7 +11419,6 @@
                 <w:szCs w:val="40"/>
                 <w:lang w:val="it-IT"/>
               </w:rPr>
-              <w:lastRenderedPageBreak/>
               <w:t>36</w:t>
             </w:r>
             <w:r>
@@ -11669,7 +11978,6 @@
                 <w:szCs w:val="40"/>
                 <w:lang w:val="it-IT"/>
               </w:rPr>
-              <w:lastRenderedPageBreak/>
               <w:t>E¥</w:t>
             </w:r>
             <w:r>
@@ -11863,7 +12171,6 @@
                 <w:color w:val="000000"/>
                 <w:szCs w:val="40"/>
               </w:rPr>
-              <w:lastRenderedPageBreak/>
               <w:t>32</w:t>
             </w:r>
             <w:r>
@@ -11967,8 +12274,19 @@
                 <w:sz w:val="32"/>
                 <w:szCs w:val="40"/>
               </w:rPr>
-              <w:t>)-  A</w:t>
-            </w:r>
+              <w:t>)</w:t>
+            </w:r>
+            <w:proofErr w:type="gramStart"/>
+            <w:r>
+              <w:rPr>
+                <w:rFonts w:ascii="BRH Malayalam Extra" w:hAnsi="BRH Malayalam Extra" w:cs="BRH Malayalam Extra"/>
+                <w:color w:val="000000"/>
+                <w:sz w:val="32"/>
+                <w:szCs w:val="40"/>
+              </w:rPr>
+              <w:t>-  A</w:t>
+            </w:r>
+            <w:proofErr w:type="gramEnd"/>
             <w:r>
               <w:rPr>
                 <w:rFonts w:ascii="BRH Malayalam Extra" w:hAnsi="BRH Malayalam Extra" w:cs="BRH Malayalam Extra"/>
@@ -12281,8 +12599,19 @@
                 <w:sz w:val="32"/>
                 <w:szCs w:val="40"/>
               </w:rPr>
-              <w:t>)-  A</w:t>
-            </w:r>
+              <w:t>)</w:t>
+            </w:r>
+            <w:proofErr w:type="gramStart"/>
+            <w:r>
+              <w:rPr>
+                <w:rFonts w:ascii="BRH Malayalam Extra" w:hAnsi="BRH Malayalam Extra" w:cs="BRH Malayalam Extra"/>
+                <w:color w:val="000000"/>
+                <w:sz w:val="32"/>
+                <w:szCs w:val="40"/>
+              </w:rPr>
+              <w:t>-  A</w:t>
+            </w:r>
+            <w:proofErr w:type="gramEnd"/>
             <w:r>
               <w:rPr>
                 <w:rFonts w:ascii="BRH Malayalam Extra" w:hAnsi="BRH Malayalam Extra" w:cs="BRH Malayalam Extra"/>
@@ -12494,6 +12823,7 @@
                 <w:color w:val="000000"/>
                 <w:szCs w:val="40"/>
               </w:rPr>
+              <w:lastRenderedPageBreak/>
               <w:t>26</w:t>
             </w:r>
             <w:r>
@@ -12597,8 +12927,19 @@
                 <w:sz w:val="32"/>
                 <w:szCs w:val="40"/>
               </w:rPr>
-              <w:t>)-  B</w:t>
-            </w:r>
+              <w:t>)</w:t>
+            </w:r>
+            <w:proofErr w:type="gramStart"/>
+            <w:r>
+              <w:rPr>
+                <w:rFonts w:ascii="BRH Malayalam Extra" w:hAnsi="BRH Malayalam Extra" w:cs="BRH Malayalam Extra"/>
+                <w:color w:val="000000"/>
+                <w:sz w:val="32"/>
+                <w:szCs w:val="40"/>
+              </w:rPr>
+              <w:t>-  B</w:t>
+            </w:r>
+            <w:proofErr w:type="gramEnd"/>
             <w:r>
               <w:rPr>
                 <w:rFonts w:ascii="BRH Malayalam Extra" w:hAnsi="BRH Malayalam Extra" w:cs="BRH Malayalam Extra"/>
@@ -13267,7 +13608,27 @@
                 <w:sz w:val="32"/>
                 <w:szCs w:val="40"/>
               </w:rPr>
-              <w:t>)-  N£</w:t>
+              <w:t>)</w:t>
+            </w:r>
+            <w:proofErr w:type="gramStart"/>
+            <w:r>
+              <w:rPr>
+                <w:rFonts w:ascii="BRH Malayalam Extra" w:hAnsi="BRH Malayalam Extra" w:cs="BRH Malayalam Extra"/>
+                <w:color w:val="000000"/>
+                <w:sz w:val="32"/>
+                <w:szCs w:val="40"/>
+              </w:rPr>
+              <w:t>-  N</w:t>
+            </w:r>
+            <w:proofErr w:type="gramEnd"/>
+            <w:r>
+              <w:rPr>
+                <w:rFonts w:ascii="BRH Malayalam Extra" w:hAnsi="BRH Malayalam Extra" w:cs="BRH Malayalam Extra"/>
+                <w:color w:val="000000"/>
+                <w:sz w:val="32"/>
+                <w:szCs w:val="40"/>
+              </w:rPr>
+              <w:t>£</w:t>
             </w:r>
             <w:r>
               <w:rPr>
@@ -13650,7 +14011,27 @@
                 <w:sz w:val="32"/>
                 <w:szCs w:val="40"/>
               </w:rPr>
-              <w:t>)-  N£</w:t>
+              <w:t>)</w:t>
+            </w:r>
+            <w:proofErr w:type="gramStart"/>
+            <w:r>
+              <w:rPr>
+                <w:rFonts w:ascii="BRH Malayalam Extra" w:hAnsi="BRH Malayalam Extra" w:cs="BRH Malayalam Extra"/>
+                <w:color w:val="000000"/>
+                <w:sz w:val="32"/>
+                <w:szCs w:val="40"/>
+              </w:rPr>
+              <w:t>-  N</w:t>
+            </w:r>
+            <w:proofErr w:type="gramEnd"/>
+            <w:r>
+              <w:rPr>
+                <w:rFonts w:ascii="BRH Malayalam Extra" w:hAnsi="BRH Malayalam Extra" w:cs="BRH Malayalam Extra"/>
+                <w:color w:val="000000"/>
+                <w:sz w:val="32"/>
+                <w:szCs w:val="40"/>
+              </w:rPr>
+              <w:t>£</w:t>
             </w:r>
             <w:r>
               <w:rPr>
@@ -13988,8 +14369,19 @@
                 <w:sz w:val="32"/>
                 <w:szCs w:val="40"/>
               </w:rPr>
-              <w:t>)-  B</w:t>
-            </w:r>
+              <w:t>)</w:t>
+            </w:r>
+            <w:proofErr w:type="gramStart"/>
+            <w:r>
+              <w:rPr>
+                <w:rFonts w:ascii="BRH Malayalam Extra" w:hAnsi="BRH Malayalam Extra" w:cs="BRH Malayalam Extra"/>
+                <w:color w:val="000000"/>
+                <w:sz w:val="32"/>
+                <w:szCs w:val="40"/>
+              </w:rPr>
+              <w:t>-  B</w:t>
+            </w:r>
+            <w:proofErr w:type="gramEnd"/>
             <w:r>
               <w:rPr>
                 <w:rFonts w:ascii="BRH Malayalam Extra" w:hAnsi="BRH Malayalam Extra" w:cs="BRH Malayalam Extra"/>
@@ -14443,7 +14835,27 @@
                 <w:sz w:val="32"/>
                 <w:szCs w:val="40"/>
               </w:rPr>
-              <w:t>)-  N£</w:t>
+              <w:t>)</w:t>
+            </w:r>
+            <w:proofErr w:type="gramStart"/>
+            <w:r>
+              <w:rPr>
+                <w:rFonts w:ascii="BRH Malayalam Extra" w:hAnsi="BRH Malayalam Extra" w:cs="BRH Malayalam Extra"/>
+                <w:color w:val="000000"/>
+                <w:sz w:val="32"/>
+                <w:szCs w:val="40"/>
+              </w:rPr>
+              <w:t>-  N</w:t>
+            </w:r>
+            <w:proofErr w:type="gramEnd"/>
+            <w:r>
+              <w:rPr>
+                <w:rFonts w:ascii="BRH Malayalam Extra" w:hAnsi="BRH Malayalam Extra" w:cs="BRH Malayalam Extra"/>
+                <w:color w:val="000000"/>
+                <w:sz w:val="32"/>
+                <w:szCs w:val="40"/>
+              </w:rPr>
+              <w:t>£</w:t>
             </w:r>
             <w:r>
               <w:rPr>
@@ -14807,7 +15219,27 @@
                 <w:sz w:val="32"/>
                 <w:szCs w:val="40"/>
               </w:rPr>
-              <w:t>)-  N£</w:t>
+              <w:t>)</w:t>
+            </w:r>
+            <w:proofErr w:type="gramStart"/>
+            <w:r>
+              <w:rPr>
+                <w:rFonts w:ascii="BRH Malayalam Extra" w:hAnsi="BRH Malayalam Extra" w:cs="BRH Malayalam Extra"/>
+                <w:color w:val="000000"/>
+                <w:sz w:val="32"/>
+                <w:szCs w:val="40"/>
+              </w:rPr>
+              <w:t>-  N</w:t>
+            </w:r>
+            <w:proofErr w:type="gramEnd"/>
+            <w:r>
+              <w:rPr>
+                <w:rFonts w:ascii="BRH Malayalam Extra" w:hAnsi="BRH Malayalam Extra" w:cs="BRH Malayalam Extra"/>
+                <w:color w:val="000000"/>
+                <w:sz w:val="32"/>
+                <w:szCs w:val="40"/>
+              </w:rPr>
+              <w:t>£</w:t>
             </w:r>
             <w:r>
               <w:rPr>
@@ -15050,7 +15482,6 @@
                 <w:szCs w:val="40"/>
                 <w:lang w:val="it-IT"/>
               </w:rPr>
-              <w:lastRenderedPageBreak/>
               <w:t>42</w:t>
             </w:r>
             <w:r>
@@ -16622,169 +17053,11 @@
               <w:adjustRightInd w:val="0"/>
               <w:spacing w:before="0" w:line="240" w:lineRule="auto"/>
               <w:rPr>
-                <w:rFonts w:ascii="BRH Malayalam Extra" w:hAnsi="BRH Malayalam Extra" w:cs="BRH Malayalam Extra"/>
-                <w:color w:val="000000"/>
-                <w:sz w:val="32"/>
+                <w:rFonts w:cs="BRH Malayalam Extra"/>
+                <w:color w:val="000000"/>
                 <w:szCs w:val="40"/>
               </w:rPr>
             </w:pPr>
-            <w:r>
-              <w:rPr>
-                <w:rFonts w:cs="BRH Malayalam Extra"/>
-                <w:color w:val="000000"/>
-                <w:szCs w:val="40"/>
-              </w:rPr>
-              <w:t>47</w:t>
-            </w:r>
-            <w:r>
-              <w:rPr>
-                <w:rFonts w:ascii="BRH Malayalam Extra" w:hAnsi="BRH Malayalam Extra" w:cs="BRH Malayalam Extra"/>
-                <w:color w:val="000000"/>
-                <w:sz w:val="32"/>
-                <w:szCs w:val="40"/>
-              </w:rPr>
-              <w:t>)</w:t>
-            </w:r>
-            <w:r>
-              <w:rPr>
-                <w:rFonts w:ascii="BRH Malayalam Extra" w:hAnsi="BRH Malayalam Extra" w:cs="BRH Malayalam Extra"/>
-                <w:color w:val="000000"/>
-                <w:sz w:val="32"/>
-                <w:szCs w:val="40"/>
-              </w:rPr>
-              <w:tab/>
-            </w:r>
-            <w:r>
-              <w:rPr>
-                <w:rFonts w:cs="BRH Malayalam Extra"/>
-                <w:color w:val="000000"/>
-                <w:szCs w:val="40"/>
-              </w:rPr>
-              <w:t>2</w:t>
-            </w:r>
-            <w:r>
-              <w:rPr>
-                <w:rFonts w:ascii="BRH Malayalam Extra" w:hAnsi="BRH Malayalam Extra" w:cs="BRH Malayalam Extra"/>
-                <w:color w:val="000000"/>
-                <w:sz w:val="32"/>
-                <w:szCs w:val="40"/>
-              </w:rPr>
-              <w:t>.</w:t>
-            </w:r>
-            <w:r>
-              <w:rPr>
-                <w:rFonts w:cs="BRH Malayalam Extra"/>
-                <w:color w:val="000000"/>
-                <w:szCs w:val="40"/>
-              </w:rPr>
-              <w:t>5</w:t>
-            </w:r>
-            <w:r>
-              <w:rPr>
-                <w:rFonts w:ascii="BRH Malayalam Extra" w:hAnsi="BRH Malayalam Extra" w:cs="BRH Malayalam Extra"/>
-                <w:color w:val="000000"/>
-                <w:sz w:val="32"/>
-                <w:szCs w:val="40"/>
-              </w:rPr>
-              <w:t>.</w:t>
-            </w:r>
-            <w:r>
-              <w:rPr>
-                <w:rFonts w:cs="BRH Malayalam Extra"/>
-                <w:color w:val="000000"/>
-                <w:szCs w:val="40"/>
-              </w:rPr>
-              <w:t>10</w:t>
-            </w:r>
-            <w:r>
-              <w:rPr>
-                <w:rFonts w:ascii="BRH Malayalam Extra" w:hAnsi="BRH Malayalam Extra" w:cs="BRH Malayalam Extra"/>
-                <w:color w:val="000000"/>
-                <w:sz w:val="32"/>
-                <w:szCs w:val="40"/>
-              </w:rPr>
-              <w:t>.</w:t>
-            </w:r>
-            <w:r>
-              <w:rPr>
-                <w:rFonts w:cs="BRH Malayalam Extra"/>
-                <w:color w:val="000000"/>
-                <w:szCs w:val="40"/>
-              </w:rPr>
-              <w:t>2</w:t>
-            </w:r>
-            <w:r>
-              <w:rPr>
-                <w:rFonts w:ascii="BRH Malayalam Extra" w:hAnsi="BRH Malayalam Extra" w:cs="BRH Malayalam Extra"/>
-                <w:color w:val="000000"/>
-                <w:sz w:val="32"/>
-                <w:szCs w:val="40"/>
-              </w:rPr>
-              <w:t>(</w:t>
-            </w:r>
-            <w:r>
-              <w:rPr>
-                <w:rFonts w:cs="BRH Malayalam Extra"/>
-                <w:color w:val="000000"/>
-                <w:szCs w:val="40"/>
-              </w:rPr>
-              <w:t>41</w:t>
-            </w:r>
-            <w:r>
-              <w:rPr>
-                <w:rFonts w:ascii="BRH Malayalam Extra" w:hAnsi="BRH Malayalam Extra" w:cs="BRH Malayalam Extra"/>
-                <w:color w:val="000000"/>
-                <w:sz w:val="32"/>
-                <w:szCs w:val="40"/>
-              </w:rPr>
-              <w:t>)-  eky— | M£</w:t>
-            </w:r>
-            <w:r>
-              <w:rPr>
-                <w:rFonts w:ascii="BRH Malayalam Extra" w:hAnsi="BRH Malayalam Extra" w:cs="BRH Malayalam Extra"/>
-                <w:color w:val="000000"/>
-                <w:sz w:val="26"/>
-                <w:szCs w:val="40"/>
-              </w:rPr>
-              <w:t>–</w:t>
-            </w:r>
-            <w:r>
-              <w:rPr>
-                <w:rFonts w:ascii="BRH Malayalam Extra" w:hAnsi="BRH Malayalam Extra" w:cs="BRH Malayalam Extra"/>
-                <w:color w:val="000000"/>
-                <w:sz w:val="32"/>
-                <w:szCs w:val="40"/>
-              </w:rPr>
-              <w:t>t§Yx</w:t>
-            </w:r>
-            <w:r>
-              <w:rPr>
-                <w:rFonts w:ascii="BRH Malayalam Extra" w:hAnsi="BRH Malayalam Extra" w:cs="BRH Malayalam Extra"/>
-                <w:color w:val="000000"/>
-                <w:sz w:val="26"/>
-                <w:szCs w:val="40"/>
-              </w:rPr>
-              <w:t>–</w:t>
-            </w:r>
-            <w:r>
-              <w:rPr>
-                <w:rFonts w:ascii="BRH Malayalam Extra" w:hAnsi="BRH Malayalam Extra" w:cs="BRH Malayalam Extra"/>
-                <w:color w:val="000000"/>
-                <w:sz w:val="32"/>
-                <w:szCs w:val="40"/>
-                <w:highlight w:val="yellow"/>
-              </w:rPr>
-              <w:t>Zy</w:t>
-            </w:r>
-            <w:r>
-              <w:rPr>
-                <w:rFonts w:ascii="BRH Malayalam Extra" w:hAnsi="BRH Malayalam Extra" w:cs="BRH Malayalam Extra"/>
-                <w:color w:val="000000"/>
-                <w:sz w:val="32"/>
-                <w:szCs w:val="40"/>
-              </w:rPr>
-              <w:t xml:space="preserve"> |</w:t>
-            </w:r>
           </w:p>
           <w:p>
             <w:pPr>
@@ -16794,125 +17067,11 @@
               <w:adjustRightInd w:val="0"/>
               <w:spacing w:before="0" w:line="240" w:lineRule="auto"/>
               <w:rPr>
-                <w:rFonts w:ascii="BRH Malayalam Extra" w:hAnsi="BRH Malayalam Extra" w:cs="BRH Malayalam Extra"/>
-                <w:color w:val="000000"/>
-                <w:sz w:val="32"/>
+                <w:rFonts w:cs="BRH Malayalam Extra"/>
+                <w:color w:val="000000"/>
                 <w:szCs w:val="40"/>
               </w:rPr>
             </w:pPr>
-            <w:r>
-              <w:rPr>
-                <w:rFonts w:ascii="BRH Malayalam Extra" w:hAnsi="BRH Malayalam Extra" w:cs="BRH Malayalam Extra"/>
-                <w:color w:val="000000"/>
-                <w:sz w:val="32"/>
-                <w:szCs w:val="40"/>
-              </w:rPr>
-              <w:t>eky— M£t§Yx</w:t>
-            </w:r>
-            <w:r>
-              <w:rPr>
-                <w:rFonts w:ascii="BRH Malayalam Extra" w:hAnsi="BRH Malayalam Extra" w:cs="BRH Malayalam Extra"/>
-                <w:color w:val="000000"/>
-                <w:sz w:val="26"/>
-                <w:szCs w:val="40"/>
-              </w:rPr>
-              <w:t>–</w:t>
-            </w:r>
-            <w:r>
-              <w:rPr>
-                <w:rFonts w:ascii="BRH Malayalam Extra" w:hAnsi="BRH Malayalam Extra" w:cs="BRH Malayalam Extra"/>
-                <w:color w:val="000000"/>
-                <w:sz w:val="32"/>
-                <w:szCs w:val="40"/>
-              </w:rPr>
-              <w:t xml:space="preserve">Zy </w:t>
-            </w:r>
-            <w:r>
-              <w:rPr>
-                <w:rFonts w:ascii="BRH Malayalam Extra" w:hAnsi="BRH Malayalam Extra" w:cs="BRH Malayalam Extra"/>
-                <w:color w:val="000000"/>
-                <w:sz w:val="32"/>
-                <w:szCs w:val="40"/>
-                <w:highlight w:val="yellow"/>
-              </w:rPr>
-              <w:t>M£—t§Yx</w:t>
-            </w:r>
-            <w:r>
-              <w:rPr>
-                <w:rFonts w:ascii="BRH Malayalam Extra" w:hAnsi="BRH Malayalam Extra" w:cs="BRH Malayalam Extra"/>
-                <w:color w:val="000000"/>
-                <w:sz w:val="26"/>
-                <w:szCs w:val="40"/>
-                <w:highlight w:val="yellow"/>
-              </w:rPr>
-              <w:t>–</w:t>
-            </w:r>
-            <w:r>
-              <w:rPr>
-                <w:rFonts w:ascii="BRH Malayalam Extra" w:hAnsi="BRH Malayalam Extra" w:cs="BRH Malayalam Extra"/>
-                <w:color w:val="000000"/>
-                <w:sz w:val="32"/>
-                <w:szCs w:val="40"/>
-                <w:highlight w:val="yellow"/>
-              </w:rPr>
-              <w:t>Zy</w:t>
-            </w:r>
-            <w:r>
-              <w:rPr>
-                <w:rFonts w:ascii="BRH Malayalam Extra" w:hAnsi="BRH Malayalam Extra" w:cs="BRH Malayalam Extra"/>
-                <w:color w:val="000000"/>
-                <w:sz w:val="32"/>
-                <w:szCs w:val="40"/>
-              </w:rPr>
-              <w:t xml:space="preserve"> eky</w:t>
-            </w:r>
-            <w:r>
-              <w:rPr>
-                <w:rFonts w:ascii="BRH Malayalam Extra" w:hAnsi="BRH Malayalam Extra" w:cs="BRH Malayalam Extra"/>
-                <w:color w:val="000000"/>
-                <w:sz w:val="26"/>
-                <w:szCs w:val="40"/>
-              </w:rPr>
-              <w:t>–</w:t>
-            </w:r>
-            <w:r>
-              <w:rPr>
-                <w:rFonts w:ascii="BRH Malayalam Extra" w:hAnsi="BRH Malayalam Extra" w:cs="BRH Malayalam Extra"/>
-                <w:color w:val="000000"/>
-                <w:sz w:val="32"/>
-                <w:szCs w:val="40"/>
-              </w:rPr>
-              <w:t xml:space="preserve"> eky— M£t§</w:t>
-            </w:r>
-            <w:r>
-              <w:rPr>
-                <w:rFonts w:ascii="BRH Malayalam Extra" w:hAnsi="BRH Malayalam Extra" w:cs="BRH Malayalam Extra"/>
-                <w:color w:val="000000"/>
-                <w:sz w:val="32"/>
-                <w:szCs w:val="40"/>
-                <w:highlight w:val="yellow"/>
-              </w:rPr>
-              <w:t>Yx</w:t>
-            </w:r>
-            <w:r>
-              <w:rPr>
-                <w:rFonts w:ascii="BRH Malayalam Extra" w:hAnsi="BRH Malayalam Extra" w:cs="BRH Malayalam Extra"/>
-                <w:color w:val="000000"/>
-                <w:sz w:val="26"/>
-                <w:szCs w:val="40"/>
-                <w:highlight w:val="yellow"/>
-              </w:rPr>
-              <w:t>–</w:t>
-            </w:r>
-            <w:r>
-              <w:rPr>
-                <w:rFonts w:ascii="BRH Malayalam Extra" w:hAnsi="BRH Malayalam Extra" w:cs="BRH Malayalam Extra"/>
-                <w:color w:val="000000"/>
-                <w:sz w:val="32"/>
-                <w:szCs w:val="40"/>
-              </w:rPr>
-              <w:t xml:space="preserve">Zy | </w:t>
-            </w:r>
           </w:p>
           <w:p>
             <w:pPr>
@@ -16934,7 +17093,8 @@
                 <w:color w:val="000000"/>
                 <w:szCs w:val="40"/>
               </w:rPr>
-              <w:t>48</w:t>
+              <w:lastRenderedPageBreak/>
+              <w:t>47</w:t>
             </w:r>
             <w:r>
               <w:rPr>
@@ -17028,16 +17188,36 @@
                 <w:color w:val="000000"/>
                 <w:szCs w:val="40"/>
               </w:rPr>
-              <w:t>42</w:t>
-            </w:r>
-            <w:r>
-              <w:rPr>
-                <w:rFonts w:ascii="BRH Malayalam Extra" w:hAnsi="BRH Malayalam Extra" w:cs="BRH Malayalam Extra"/>
-                <w:color w:val="000000"/>
-                <w:sz w:val="32"/>
-                <w:szCs w:val="40"/>
-              </w:rPr>
-              <w:t>)-  M£</w:t>
+              <w:t>41</w:t>
+            </w:r>
+            <w:r>
+              <w:rPr>
+                <w:rFonts w:ascii="BRH Malayalam Extra" w:hAnsi="BRH Malayalam Extra" w:cs="BRH Malayalam Extra"/>
+                <w:color w:val="000000"/>
+                <w:sz w:val="32"/>
+                <w:szCs w:val="40"/>
+              </w:rPr>
+              <w:t>)</w:t>
+            </w:r>
+            <w:proofErr w:type="gramStart"/>
+            <w:r>
+              <w:rPr>
+                <w:rFonts w:ascii="BRH Malayalam Extra" w:hAnsi="BRH Malayalam Extra" w:cs="BRH Malayalam Extra"/>
+                <w:color w:val="000000"/>
+                <w:sz w:val="32"/>
+                <w:szCs w:val="40"/>
+              </w:rPr>
+              <w:t>-  eky</w:t>
+            </w:r>
+            <w:proofErr w:type="gramEnd"/>
+            <w:r>
+              <w:rPr>
+                <w:rFonts w:ascii="BRH Malayalam Extra" w:hAnsi="BRH Malayalam Extra" w:cs="BRH Malayalam Extra"/>
+                <w:color w:val="000000"/>
+                <w:sz w:val="32"/>
+                <w:szCs w:val="40"/>
+              </w:rPr>
+              <w:t>— | M£</w:t>
             </w:r>
             <w:r>
               <w:rPr>
@@ -17083,7 +17263,7 @@
                 <w:sz w:val="32"/>
                 <w:szCs w:val="40"/>
               </w:rPr>
-              <w:t xml:space="preserve"> | GK—py(³§)qZyI |</w:t>
+              <w:t xml:space="preserve"> |</w:t>
             </w:r>
           </w:p>
           <w:p>
@@ -17107,6 +17287,346 @@
                 <w:sz w:val="32"/>
                 <w:szCs w:val="40"/>
               </w:rPr>
+              <w:t>eky— M£t§Yx</w:t>
+            </w:r>
+            <w:r>
+              <w:rPr>
+                <w:rFonts w:ascii="BRH Malayalam Extra" w:hAnsi="BRH Malayalam Extra" w:cs="BRH Malayalam Extra"/>
+                <w:color w:val="000000"/>
+                <w:sz w:val="26"/>
+                <w:szCs w:val="40"/>
+              </w:rPr>
+              <w:t>–</w:t>
+            </w:r>
+            <w:r>
+              <w:rPr>
+                <w:rFonts w:ascii="BRH Malayalam Extra" w:hAnsi="BRH Malayalam Extra" w:cs="BRH Malayalam Extra"/>
+                <w:color w:val="000000"/>
+                <w:sz w:val="32"/>
+                <w:szCs w:val="40"/>
+              </w:rPr>
+              <w:t xml:space="preserve">Zy </w:t>
+            </w:r>
+            <w:r>
+              <w:rPr>
+                <w:rFonts w:ascii="BRH Malayalam Extra" w:hAnsi="BRH Malayalam Extra" w:cs="BRH Malayalam Extra"/>
+                <w:color w:val="000000"/>
+                <w:sz w:val="32"/>
+                <w:szCs w:val="40"/>
+                <w:highlight w:val="yellow"/>
+              </w:rPr>
+              <w:t>M£—t§Yx</w:t>
+            </w:r>
+            <w:r>
+              <w:rPr>
+                <w:rFonts w:ascii="BRH Malayalam Extra" w:hAnsi="BRH Malayalam Extra" w:cs="BRH Malayalam Extra"/>
+                <w:color w:val="000000"/>
+                <w:sz w:val="26"/>
+                <w:szCs w:val="40"/>
+                <w:highlight w:val="yellow"/>
+              </w:rPr>
+              <w:t>–</w:t>
+            </w:r>
+            <w:r>
+              <w:rPr>
+                <w:rFonts w:ascii="BRH Malayalam Extra" w:hAnsi="BRH Malayalam Extra" w:cs="BRH Malayalam Extra"/>
+                <w:color w:val="000000"/>
+                <w:sz w:val="32"/>
+                <w:szCs w:val="40"/>
+                <w:highlight w:val="yellow"/>
+              </w:rPr>
+              <w:t>Zy</w:t>
+            </w:r>
+            <w:r>
+              <w:rPr>
+                <w:rFonts w:ascii="BRH Malayalam Extra" w:hAnsi="BRH Malayalam Extra" w:cs="BRH Malayalam Extra"/>
+                <w:color w:val="000000"/>
+                <w:sz w:val="32"/>
+                <w:szCs w:val="40"/>
+              </w:rPr>
+              <w:t xml:space="preserve"> eky</w:t>
+            </w:r>
+            <w:r>
+              <w:rPr>
+                <w:rFonts w:ascii="BRH Malayalam Extra" w:hAnsi="BRH Malayalam Extra" w:cs="BRH Malayalam Extra"/>
+                <w:color w:val="000000"/>
+                <w:sz w:val="26"/>
+                <w:szCs w:val="40"/>
+              </w:rPr>
+              <w:t>–</w:t>
+            </w:r>
+            <w:r>
+              <w:rPr>
+                <w:rFonts w:ascii="BRH Malayalam Extra" w:hAnsi="BRH Malayalam Extra" w:cs="BRH Malayalam Extra"/>
+                <w:color w:val="000000"/>
+                <w:sz w:val="32"/>
+                <w:szCs w:val="40"/>
+              </w:rPr>
+              <w:t xml:space="preserve"> eky— M£t§</w:t>
+            </w:r>
+            <w:r>
+              <w:rPr>
+                <w:rFonts w:ascii="BRH Malayalam Extra" w:hAnsi="BRH Malayalam Extra" w:cs="BRH Malayalam Extra"/>
+                <w:color w:val="000000"/>
+                <w:sz w:val="32"/>
+                <w:szCs w:val="40"/>
+                <w:highlight w:val="yellow"/>
+              </w:rPr>
+              <w:t>Yx</w:t>
+            </w:r>
+            <w:r>
+              <w:rPr>
+                <w:rFonts w:ascii="BRH Malayalam Extra" w:hAnsi="BRH Malayalam Extra" w:cs="BRH Malayalam Extra"/>
+                <w:color w:val="000000"/>
+                <w:sz w:val="26"/>
+                <w:szCs w:val="40"/>
+                <w:highlight w:val="yellow"/>
+              </w:rPr>
+              <w:t>–</w:t>
+            </w:r>
+            <w:r>
+              <w:rPr>
+                <w:rFonts w:ascii="BRH Malayalam Extra" w:hAnsi="BRH Malayalam Extra" w:cs="BRH Malayalam Extra"/>
+                <w:color w:val="000000"/>
+                <w:sz w:val="32"/>
+                <w:szCs w:val="40"/>
+              </w:rPr>
+              <w:t xml:space="preserve">Zy | </w:t>
+            </w:r>
+          </w:p>
+          <w:p>
+            <w:pPr>
+              <w:widowControl w:val="0"/>
+              <w:autoSpaceDE w:val="0"/>
+              <w:autoSpaceDN w:val="0"/>
+              <w:adjustRightInd w:val="0"/>
+              <w:spacing w:before="0" w:line="240" w:lineRule="auto"/>
+              <w:rPr>
+                <w:rFonts w:ascii="BRH Malayalam Extra" w:hAnsi="BRH Malayalam Extra" w:cs="BRH Malayalam Extra"/>
+                <w:color w:val="000000"/>
+                <w:sz w:val="32"/>
+                <w:szCs w:val="40"/>
+              </w:rPr>
+            </w:pPr>
+            <w:r>
+              <w:rPr>
+                <w:rFonts w:cs="BRH Malayalam Extra"/>
+                <w:color w:val="000000"/>
+                <w:szCs w:val="40"/>
+              </w:rPr>
+              <w:t>48</w:t>
+            </w:r>
+            <w:r>
+              <w:rPr>
+                <w:rFonts w:ascii="BRH Malayalam Extra" w:hAnsi="BRH Malayalam Extra" w:cs="BRH Malayalam Extra"/>
+                <w:color w:val="000000"/>
+                <w:sz w:val="32"/>
+                <w:szCs w:val="40"/>
+              </w:rPr>
+              <w:t>)</w:t>
+            </w:r>
+            <w:r>
+              <w:rPr>
+                <w:rFonts w:ascii="BRH Malayalam Extra" w:hAnsi="BRH Malayalam Extra" w:cs="BRH Malayalam Extra"/>
+                <w:color w:val="000000"/>
+                <w:sz w:val="32"/>
+                <w:szCs w:val="40"/>
+              </w:rPr>
+              <w:tab/>
+            </w:r>
+            <w:r>
+              <w:rPr>
+                <w:rFonts w:cs="BRH Malayalam Extra"/>
+                <w:color w:val="000000"/>
+                <w:szCs w:val="40"/>
+              </w:rPr>
+              <w:t>2</w:t>
+            </w:r>
+            <w:r>
+              <w:rPr>
+                <w:rFonts w:ascii="BRH Malayalam Extra" w:hAnsi="BRH Malayalam Extra" w:cs="BRH Malayalam Extra"/>
+                <w:color w:val="000000"/>
+                <w:sz w:val="32"/>
+                <w:szCs w:val="40"/>
+              </w:rPr>
+              <w:t>.</w:t>
+            </w:r>
+            <w:r>
+              <w:rPr>
+                <w:rFonts w:cs="BRH Malayalam Extra"/>
+                <w:color w:val="000000"/>
+                <w:szCs w:val="40"/>
+              </w:rPr>
+              <w:t>5</w:t>
+            </w:r>
+            <w:r>
+              <w:rPr>
+                <w:rFonts w:ascii="BRH Malayalam Extra" w:hAnsi="BRH Malayalam Extra" w:cs="BRH Malayalam Extra"/>
+                <w:color w:val="000000"/>
+                <w:sz w:val="32"/>
+                <w:szCs w:val="40"/>
+              </w:rPr>
+              <w:t>.</w:t>
+            </w:r>
+            <w:r>
+              <w:rPr>
+                <w:rFonts w:cs="BRH Malayalam Extra"/>
+                <w:color w:val="000000"/>
+                <w:szCs w:val="40"/>
+              </w:rPr>
+              <w:t>10</w:t>
+            </w:r>
+            <w:r>
+              <w:rPr>
+                <w:rFonts w:ascii="BRH Malayalam Extra" w:hAnsi="BRH Malayalam Extra" w:cs="BRH Malayalam Extra"/>
+                <w:color w:val="000000"/>
+                <w:sz w:val="32"/>
+                <w:szCs w:val="40"/>
+              </w:rPr>
+              <w:t>.</w:t>
+            </w:r>
+            <w:r>
+              <w:rPr>
+                <w:rFonts w:cs="BRH Malayalam Extra"/>
+                <w:color w:val="000000"/>
+                <w:szCs w:val="40"/>
+              </w:rPr>
+              <w:t>2</w:t>
+            </w:r>
+            <w:r>
+              <w:rPr>
+                <w:rFonts w:ascii="BRH Malayalam Extra" w:hAnsi="BRH Malayalam Extra" w:cs="BRH Malayalam Extra"/>
+                <w:color w:val="000000"/>
+                <w:sz w:val="32"/>
+                <w:szCs w:val="40"/>
+              </w:rPr>
+              <w:t>(</w:t>
+            </w:r>
+            <w:r>
+              <w:rPr>
+                <w:rFonts w:cs="BRH Malayalam Extra"/>
+                <w:color w:val="000000"/>
+                <w:szCs w:val="40"/>
+              </w:rPr>
+              <w:t>42</w:t>
+            </w:r>
+            <w:r>
+              <w:rPr>
+                <w:rFonts w:ascii="BRH Malayalam Extra" w:hAnsi="BRH Malayalam Extra" w:cs="BRH Malayalam Extra"/>
+                <w:color w:val="000000"/>
+                <w:sz w:val="32"/>
+                <w:szCs w:val="40"/>
+              </w:rPr>
+              <w:t>)</w:t>
+            </w:r>
+            <w:proofErr w:type="gramStart"/>
+            <w:r>
+              <w:rPr>
+                <w:rFonts w:ascii="BRH Malayalam Extra" w:hAnsi="BRH Malayalam Extra" w:cs="BRH Malayalam Extra"/>
+                <w:color w:val="000000"/>
+                <w:sz w:val="32"/>
+                <w:szCs w:val="40"/>
+              </w:rPr>
+              <w:t>-  M</w:t>
+            </w:r>
+            <w:proofErr w:type="gramEnd"/>
+            <w:r>
+              <w:rPr>
+                <w:rFonts w:ascii="BRH Malayalam Extra" w:hAnsi="BRH Malayalam Extra" w:cs="BRH Malayalam Extra"/>
+                <w:color w:val="000000"/>
+                <w:sz w:val="32"/>
+                <w:szCs w:val="40"/>
+              </w:rPr>
+              <w:t>£</w:t>
+            </w:r>
+            <w:r>
+              <w:rPr>
+                <w:rFonts w:ascii="BRH Malayalam Extra" w:hAnsi="BRH Malayalam Extra" w:cs="BRH Malayalam Extra"/>
+                <w:color w:val="000000"/>
+                <w:sz w:val="26"/>
+                <w:szCs w:val="40"/>
+              </w:rPr>
+              <w:t>–</w:t>
+            </w:r>
+            <w:r>
+              <w:rPr>
+                <w:rFonts w:ascii="BRH Malayalam Extra" w:hAnsi="BRH Malayalam Extra" w:cs="BRH Malayalam Extra"/>
+                <w:color w:val="000000"/>
+                <w:sz w:val="32"/>
+                <w:szCs w:val="40"/>
+              </w:rPr>
+              <w:t>t§Yx</w:t>
+            </w:r>
+            <w:r>
+              <w:rPr>
+                <w:rFonts w:ascii="BRH Malayalam Extra" w:hAnsi="BRH Malayalam Extra" w:cs="BRH Malayalam Extra"/>
+                <w:color w:val="000000"/>
+                <w:sz w:val="26"/>
+                <w:szCs w:val="40"/>
+              </w:rPr>
+              <w:t>–</w:t>
+            </w:r>
+            <w:r>
+              <w:rPr>
+                <w:rFonts w:ascii="BRH Malayalam Extra" w:hAnsi="BRH Malayalam Extra" w:cs="BRH Malayalam Extra"/>
+                <w:color w:val="000000"/>
+                <w:sz w:val="32"/>
+                <w:szCs w:val="40"/>
+                <w:highlight w:val="yellow"/>
+              </w:rPr>
+              <w:t>Zy</w:t>
+            </w:r>
+            <w:r>
+              <w:rPr>
+                <w:rFonts w:ascii="BRH Malayalam Extra" w:hAnsi="BRH Malayalam Extra" w:cs="BRH Malayalam Extra"/>
+                <w:color w:val="000000"/>
+                <w:sz w:val="32"/>
+                <w:szCs w:val="40"/>
+              </w:rPr>
+              <w:t xml:space="preserve"> | GK—py(³</w:t>
+            </w:r>
+            <w:proofErr w:type="gramStart"/>
+            <w:r>
+              <w:rPr>
+                <w:rFonts w:ascii="BRH Malayalam Extra" w:hAnsi="BRH Malayalam Extra" w:cs="BRH Malayalam Extra"/>
+                <w:color w:val="000000"/>
+                <w:sz w:val="32"/>
+                <w:szCs w:val="40"/>
+              </w:rPr>
+              <w:t>§)qZyI</w:t>
+            </w:r>
+            <w:proofErr w:type="gramEnd"/>
+            <w:r>
+              <w:rPr>
+                <w:rFonts w:ascii="BRH Malayalam Extra" w:hAnsi="BRH Malayalam Extra" w:cs="BRH Malayalam Extra"/>
+                <w:color w:val="000000"/>
+                <w:sz w:val="32"/>
+                <w:szCs w:val="40"/>
+              </w:rPr>
+              <w:t xml:space="preserve"> |</w:t>
+            </w:r>
+          </w:p>
+          <w:p>
+            <w:pPr>
+              <w:widowControl w:val="0"/>
+              <w:autoSpaceDE w:val="0"/>
+              <w:autoSpaceDN w:val="0"/>
+              <w:adjustRightInd w:val="0"/>
+              <w:spacing w:before="0" w:line="240" w:lineRule="auto"/>
+              <w:rPr>
+                <w:rFonts w:ascii="BRH Malayalam Extra" w:hAnsi="BRH Malayalam Extra" w:cs="BRH Malayalam Extra"/>
+                <w:color w:val="000000"/>
+                <w:sz w:val="32"/>
+                <w:szCs w:val="40"/>
+              </w:rPr>
+            </w:pPr>
+            <w:r>
+              <w:rPr>
+                <w:rFonts w:ascii="BRH Malayalam Extra" w:hAnsi="BRH Malayalam Extra" w:cs="BRH Malayalam Extra"/>
+                <w:color w:val="000000"/>
+                <w:sz w:val="32"/>
+                <w:szCs w:val="40"/>
+              </w:rPr>
               <w:t>M£</w:t>
             </w:r>
             <w:r>
@@ -17143,25 +17663,56 @@
                 <w:sz w:val="32"/>
                 <w:szCs w:val="40"/>
               </w:rPr>
-              <w:t xml:space="preserve"> ¥ZõK—py(³§)qZy</w:t>
-            </w:r>
-            <w:r>
-              <w:rPr>
-                <w:rFonts w:ascii="BRH Malayalam Extra" w:hAnsi="BRH Malayalam Extra" w:cs="BRH Malayalam Extra"/>
-                <w:color w:val="000000"/>
-                <w:sz w:val="26"/>
-                <w:szCs w:val="40"/>
-              </w:rPr>
-              <w:t>–</w:t>
-            </w:r>
-            <w:r>
-              <w:rPr>
-                <w:rFonts w:ascii="BRH Malayalam Extra" w:hAnsi="BRH Malayalam Extra" w:cs="BRH Malayalam Extra"/>
-                <w:color w:val="000000"/>
-                <w:sz w:val="32"/>
-                <w:szCs w:val="40"/>
-              </w:rPr>
-              <w:t xml:space="preserve"> ¥iK—py(³§)qZyI M£t§</w:t>
+              <w:t xml:space="preserve"> ¥ZõK—py(³</w:t>
+            </w:r>
+            <w:proofErr w:type="gramStart"/>
+            <w:r>
+              <w:rPr>
+                <w:rFonts w:ascii="BRH Malayalam Extra" w:hAnsi="BRH Malayalam Extra" w:cs="BRH Malayalam Extra"/>
+                <w:color w:val="000000"/>
+                <w:sz w:val="32"/>
+                <w:szCs w:val="40"/>
+              </w:rPr>
+              <w:t>§)qZy</w:t>
+            </w:r>
+            <w:proofErr w:type="gramEnd"/>
+            <w:r>
+              <w:rPr>
+                <w:rFonts w:ascii="BRH Malayalam Extra" w:hAnsi="BRH Malayalam Extra" w:cs="BRH Malayalam Extra"/>
+                <w:color w:val="000000"/>
+                <w:sz w:val="26"/>
+                <w:szCs w:val="40"/>
+              </w:rPr>
+              <w:t>–</w:t>
+            </w:r>
+            <w:r>
+              <w:rPr>
+                <w:rFonts w:ascii="BRH Malayalam Extra" w:hAnsi="BRH Malayalam Extra" w:cs="BRH Malayalam Extra"/>
+                <w:color w:val="000000"/>
+                <w:sz w:val="32"/>
+                <w:szCs w:val="40"/>
+              </w:rPr>
+              <w:t xml:space="preserve"> ¥iK—py(³</w:t>
+            </w:r>
+            <w:proofErr w:type="gramStart"/>
+            <w:r>
+              <w:rPr>
+                <w:rFonts w:ascii="BRH Malayalam Extra" w:hAnsi="BRH Malayalam Extra" w:cs="BRH Malayalam Extra"/>
+                <w:color w:val="000000"/>
+                <w:sz w:val="32"/>
+                <w:szCs w:val="40"/>
+              </w:rPr>
+              <w:t>§)qZyI</w:t>
+            </w:r>
+            <w:proofErr w:type="gramEnd"/>
+            <w:r>
+              <w:rPr>
+                <w:rFonts w:ascii="BRH Malayalam Extra" w:hAnsi="BRH Malayalam Extra" w:cs="BRH Malayalam Extra"/>
+                <w:color w:val="000000"/>
+                <w:sz w:val="32"/>
+                <w:szCs w:val="40"/>
+              </w:rPr>
+              <w:t xml:space="preserve"> M£t§</w:t>
             </w:r>
             <w:r>
               <w:rPr>
@@ -17227,7 +17778,27 @@
                 <w:sz w:val="32"/>
                 <w:szCs w:val="40"/>
               </w:rPr>
-              <w:t xml:space="preserve"> ¥ZõK—py(³§)qZyI | </w:t>
+              <w:t xml:space="preserve"> ¥ZõK—py(³</w:t>
+            </w:r>
+            <w:proofErr w:type="gramStart"/>
+            <w:r>
+              <w:rPr>
+                <w:rFonts w:ascii="BRH Malayalam Extra" w:hAnsi="BRH Malayalam Extra" w:cs="BRH Malayalam Extra"/>
+                <w:color w:val="000000"/>
+                <w:sz w:val="32"/>
+                <w:szCs w:val="40"/>
+              </w:rPr>
+              <w:t>§)qZyI</w:t>
+            </w:r>
+            <w:proofErr w:type="gramEnd"/>
+            <w:r>
+              <w:rPr>
+                <w:rFonts w:ascii="BRH Malayalam Extra" w:hAnsi="BRH Malayalam Extra" w:cs="BRH Malayalam Extra"/>
+                <w:color w:val="000000"/>
+                <w:sz w:val="32"/>
+                <w:szCs w:val="40"/>
+              </w:rPr>
+              <w:t xml:space="preserve"> | </w:t>
             </w:r>
           </w:p>
           <w:p>
@@ -17263,180 +17834,11 @@
               <w:adjustRightInd w:val="0"/>
               <w:spacing w:before="0" w:line="240" w:lineRule="auto"/>
               <w:rPr>
-                <w:rFonts w:ascii="BRH Malayalam Extra" w:hAnsi="BRH Malayalam Extra" w:cs="BRH Malayalam Extra"/>
-                <w:color w:val="000000"/>
-                <w:sz w:val="32"/>
+                <w:rFonts w:cs="BRH Malayalam Extra"/>
+                <w:color w:val="000000"/>
                 <w:szCs w:val="40"/>
               </w:rPr>
             </w:pPr>
-            <w:r>
-              <w:rPr>
-                <w:rFonts w:cs="BRH Malayalam Extra"/>
-                <w:color w:val="000000"/>
-                <w:szCs w:val="40"/>
-              </w:rPr>
-              <w:t>47</w:t>
-            </w:r>
-            <w:r>
-              <w:rPr>
-                <w:rFonts w:ascii="BRH Malayalam Extra" w:hAnsi="BRH Malayalam Extra" w:cs="BRH Malayalam Extra"/>
-                <w:color w:val="000000"/>
-                <w:sz w:val="32"/>
-                <w:szCs w:val="40"/>
-              </w:rPr>
-              <w:t>)</w:t>
-            </w:r>
-            <w:r>
-              <w:rPr>
-                <w:rFonts w:ascii="BRH Malayalam Extra" w:hAnsi="BRH Malayalam Extra" w:cs="BRH Malayalam Extra"/>
-                <w:color w:val="000000"/>
-                <w:sz w:val="32"/>
-                <w:szCs w:val="40"/>
-              </w:rPr>
-              <w:tab/>
-            </w:r>
-            <w:r>
-              <w:rPr>
-                <w:rFonts w:cs="BRH Malayalam Extra"/>
-                <w:color w:val="000000"/>
-                <w:szCs w:val="40"/>
-              </w:rPr>
-              <w:t>2</w:t>
-            </w:r>
-            <w:r>
-              <w:rPr>
-                <w:rFonts w:ascii="BRH Malayalam Extra" w:hAnsi="BRH Malayalam Extra" w:cs="BRH Malayalam Extra"/>
-                <w:color w:val="000000"/>
-                <w:sz w:val="32"/>
-                <w:szCs w:val="40"/>
-              </w:rPr>
-              <w:t>.</w:t>
-            </w:r>
-            <w:r>
-              <w:rPr>
-                <w:rFonts w:cs="BRH Malayalam Extra"/>
-                <w:color w:val="000000"/>
-                <w:szCs w:val="40"/>
-              </w:rPr>
-              <w:t>5</w:t>
-            </w:r>
-            <w:r>
-              <w:rPr>
-                <w:rFonts w:ascii="BRH Malayalam Extra" w:hAnsi="BRH Malayalam Extra" w:cs="BRH Malayalam Extra"/>
-                <w:color w:val="000000"/>
-                <w:sz w:val="32"/>
-                <w:szCs w:val="40"/>
-              </w:rPr>
-              <w:t>.</w:t>
-            </w:r>
-            <w:r>
-              <w:rPr>
-                <w:rFonts w:cs="BRH Malayalam Extra"/>
-                <w:color w:val="000000"/>
-                <w:szCs w:val="40"/>
-              </w:rPr>
-              <w:t>10</w:t>
-            </w:r>
-            <w:r>
-              <w:rPr>
-                <w:rFonts w:ascii="BRH Malayalam Extra" w:hAnsi="BRH Malayalam Extra" w:cs="BRH Malayalam Extra"/>
-                <w:color w:val="000000"/>
-                <w:sz w:val="32"/>
-                <w:szCs w:val="40"/>
-              </w:rPr>
-              <w:t>.</w:t>
-            </w:r>
-            <w:r>
-              <w:rPr>
-                <w:rFonts w:cs="BRH Malayalam Extra"/>
-                <w:color w:val="000000"/>
-                <w:szCs w:val="40"/>
-              </w:rPr>
-              <w:t>2</w:t>
-            </w:r>
-            <w:r>
-              <w:rPr>
-                <w:rFonts w:ascii="BRH Malayalam Extra" w:hAnsi="BRH Malayalam Extra" w:cs="BRH Malayalam Extra"/>
-                <w:color w:val="000000"/>
-                <w:sz w:val="32"/>
-                <w:szCs w:val="40"/>
-              </w:rPr>
-              <w:t>(</w:t>
-            </w:r>
-            <w:r>
-              <w:rPr>
-                <w:rFonts w:cs="BRH Malayalam Extra"/>
-                <w:color w:val="000000"/>
-                <w:szCs w:val="40"/>
-              </w:rPr>
-              <w:t>41</w:t>
-            </w:r>
-            <w:r>
-              <w:rPr>
-                <w:rFonts w:ascii="BRH Malayalam Extra" w:hAnsi="BRH Malayalam Extra" w:cs="BRH Malayalam Extra"/>
-                <w:color w:val="000000"/>
-                <w:sz w:val="32"/>
-                <w:szCs w:val="40"/>
-              </w:rPr>
-              <w:t>)-  eky— | M£</w:t>
-            </w:r>
-            <w:r>
-              <w:rPr>
-                <w:rFonts w:ascii="BRH Malayalam Extra" w:hAnsi="BRH Malayalam Extra" w:cs="BRH Malayalam Extra"/>
-                <w:color w:val="000000"/>
-                <w:sz w:val="26"/>
-                <w:szCs w:val="40"/>
-              </w:rPr>
-              <w:t>–</w:t>
-            </w:r>
-            <w:r>
-              <w:rPr>
-                <w:rFonts w:ascii="BRH Malayalam Extra" w:hAnsi="BRH Malayalam Extra" w:cs="BRH Malayalam Extra"/>
-                <w:color w:val="000000"/>
-                <w:sz w:val="32"/>
-                <w:szCs w:val="40"/>
-              </w:rPr>
-              <w:t>t§Yx</w:t>
-            </w:r>
-            <w:r>
-              <w:rPr>
-                <w:rFonts w:ascii="BRH Malayalam Extra" w:hAnsi="BRH Malayalam Extra" w:cs="BRH Malayalam Extra"/>
-                <w:color w:val="000000"/>
-                <w:sz w:val="26"/>
-                <w:szCs w:val="40"/>
-              </w:rPr>
-              <w:t>–</w:t>
-            </w:r>
-            <w:r>
-              <w:rPr>
-                <w:rFonts w:ascii="BRH Malayalam Extra" w:hAnsi="BRH Malayalam Extra" w:cs="BRH Malayalam Extra"/>
-                <w:color w:val="000000"/>
-                <w:sz w:val="32"/>
-                <w:szCs w:val="40"/>
-                <w:highlight w:val="green"/>
-              </w:rPr>
-              <w:t>Zy</w:t>
-            </w:r>
-            <w:r>
-              <w:rPr>
-                <w:rFonts w:ascii="BRH Malayalam Extra" w:hAnsi="BRH Malayalam Extra" w:cs="BRH Malayalam Extra"/>
-                <w:color w:val="000000"/>
-                <w:sz w:val="26"/>
-                <w:szCs w:val="40"/>
-                <w:highlight w:val="green"/>
-              </w:rPr>
-              <w:t>–</w:t>
-            </w:r>
-            <w:r>
-              <w:rPr>
-                <w:rFonts w:ascii="BRH Malayalam Extra" w:hAnsi="BRH Malayalam Extra" w:cs="BRH Malayalam Extra"/>
-                <w:color w:val="000000"/>
-                <w:sz w:val="32"/>
-                <w:szCs w:val="40"/>
-                <w:highlight w:val="green"/>
-              </w:rPr>
-              <w:t xml:space="preserve"> |</w:t>
-            </w:r>
           </w:p>
           <w:p>
             <w:pPr>
@@ -17446,105 +17848,11 @@
               <w:adjustRightInd w:val="0"/>
               <w:spacing w:before="0" w:line="240" w:lineRule="auto"/>
               <w:rPr>
-                <w:rFonts w:ascii="BRH Malayalam Extra" w:hAnsi="BRH Malayalam Extra" w:cs="BRH Malayalam Extra"/>
-                <w:color w:val="000000"/>
-                <w:sz w:val="32"/>
+                <w:rFonts w:cs="BRH Malayalam Extra"/>
+                <w:color w:val="000000"/>
                 <w:szCs w:val="40"/>
               </w:rPr>
             </w:pPr>
-            <w:r>
-              <w:rPr>
-                <w:rFonts w:ascii="BRH Malayalam Extra" w:hAnsi="BRH Malayalam Extra" w:cs="BRH Malayalam Extra"/>
-                <w:color w:val="000000"/>
-                <w:sz w:val="32"/>
-                <w:szCs w:val="40"/>
-              </w:rPr>
-              <w:t>eky— M£t§</w:t>
-            </w:r>
-            <w:r>
-              <w:rPr>
-                <w:rFonts w:ascii="BRH Malayalam Extra" w:hAnsi="BRH Malayalam Extra" w:cs="BRH Malayalam Extra"/>
-                <w:color w:val="000000"/>
-                <w:sz w:val="32"/>
-                <w:szCs w:val="40"/>
-                <w:highlight w:val="green"/>
-              </w:rPr>
-              <w:t>Yx</w:t>
-            </w:r>
-            <w:r>
-              <w:rPr>
-                <w:rFonts w:ascii="BRH Malayalam Extra" w:hAnsi="BRH Malayalam Extra" w:cs="BRH Malayalam Extra"/>
-                <w:color w:val="000000"/>
-                <w:sz w:val="32"/>
-                <w:szCs w:val="40"/>
-              </w:rPr>
-              <w:t xml:space="preserve">Zy </w:t>
-            </w:r>
-            <w:r>
-              <w:rPr>
-                <w:rFonts w:ascii="BRH Malayalam Extra" w:hAnsi="BRH Malayalam Extra" w:cs="BRH Malayalam Extra"/>
-                <w:color w:val="000000"/>
-                <w:sz w:val="32"/>
-                <w:szCs w:val="40"/>
-                <w:highlight w:val="green"/>
-              </w:rPr>
-              <w:t>M£t§YxZy</w:t>
-            </w:r>
-            <w:r>
-              <w:rPr>
-                <w:rFonts w:ascii="BRH Malayalam Extra" w:hAnsi="BRH Malayalam Extra" w:cs="BRH Malayalam Extra"/>
-                <w:color w:val="000000"/>
-                <w:sz w:val="26"/>
-                <w:szCs w:val="40"/>
-              </w:rPr>
-              <w:t>–</w:t>
-            </w:r>
-            <w:r>
-              <w:rPr>
-                <w:rFonts w:ascii="BRH Malayalam Extra" w:hAnsi="BRH Malayalam Extra" w:cs="BRH Malayalam Extra"/>
-                <w:color w:val="000000"/>
-                <w:sz w:val="32"/>
-                <w:szCs w:val="40"/>
-              </w:rPr>
-              <w:t xml:space="preserve"> eky</w:t>
-            </w:r>
-            <w:r>
-              <w:rPr>
-                <w:rFonts w:ascii="BRH Malayalam Extra" w:hAnsi="BRH Malayalam Extra" w:cs="BRH Malayalam Extra"/>
-                <w:color w:val="000000"/>
-                <w:sz w:val="26"/>
-                <w:szCs w:val="40"/>
-              </w:rPr>
-              <w:t>–</w:t>
-            </w:r>
-            <w:r>
-              <w:rPr>
-                <w:rFonts w:ascii="BRH Malayalam Extra" w:hAnsi="BRH Malayalam Extra" w:cs="BRH Malayalam Extra"/>
-                <w:color w:val="000000"/>
-                <w:sz w:val="32"/>
-                <w:szCs w:val="40"/>
-              </w:rPr>
-              <w:t xml:space="preserve"> eky— M£t§</w:t>
-            </w:r>
-            <w:r>
-              <w:rPr>
-                <w:rFonts w:ascii="BRH Malayalam Extra" w:hAnsi="BRH Malayalam Extra" w:cs="BRH Malayalam Extra"/>
-                <w:color w:val="000000"/>
-                <w:sz w:val="32"/>
-                <w:szCs w:val="40"/>
-                <w:highlight w:val="green"/>
-              </w:rPr>
-              <w:t>Yx</w:t>
-            </w:r>
-            <w:r>
-              <w:rPr>
-                <w:rFonts w:ascii="BRH Malayalam Extra" w:hAnsi="BRH Malayalam Extra" w:cs="BRH Malayalam Extra"/>
-                <w:color w:val="000000"/>
-                <w:sz w:val="32"/>
-                <w:szCs w:val="40"/>
-              </w:rPr>
-              <w:t xml:space="preserve">Zy | </w:t>
-            </w:r>
           </w:p>
           <w:p>
             <w:pPr>
@@ -17566,7 +17874,8 @@
                 <w:color w:val="000000"/>
                 <w:szCs w:val="40"/>
               </w:rPr>
-              <w:t>48</w:t>
+              <w:lastRenderedPageBreak/>
+              <w:t>47</w:t>
             </w:r>
             <w:r>
               <w:rPr>
@@ -17660,16 +17969,36 @@
                 <w:color w:val="000000"/>
                 <w:szCs w:val="40"/>
               </w:rPr>
-              <w:t>42</w:t>
-            </w:r>
-            <w:r>
-              <w:rPr>
-                <w:rFonts w:ascii="BRH Malayalam Extra" w:hAnsi="BRH Malayalam Extra" w:cs="BRH Malayalam Extra"/>
-                <w:color w:val="000000"/>
-                <w:sz w:val="32"/>
-                <w:szCs w:val="40"/>
-              </w:rPr>
-              <w:t>)-  M£</w:t>
+              <w:t>41</w:t>
+            </w:r>
+            <w:r>
+              <w:rPr>
+                <w:rFonts w:ascii="BRH Malayalam Extra" w:hAnsi="BRH Malayalam Extra" w:cs="BRH Malayalam Extra"/>
+                <w:color w:val="000000"/>
+                <w:sz w:val="32"/>
+                <w:szCs w:val="40"/>
+              </w:rPr>
+              <w:t>)</w:t>
+            </w:r>
+            <w:proofErr w:type="gramStart"/>
+            <w:r>
+              <w:rPr>
+                <w:rFonts w:ascii="BRH Malayalam Extra" w:hAnsi="BRH Malayalam Extra" w:cs="BRH Malayalam Extra"/>
+                <w:color w:val="000000"/>
+                <w:sz w:val="32"/>
+                <w:szCs w:val="40"/>
+              </w:rPr>
+              <w:t>-  eky</w:t>
+            </w:r>
+            <w:proofErr w:type="gramEnd"/>
+            <w:r>
+              <w:rPr>
+                <w:rFonts w:ascii="BRH Malayalam Extra" w:hAnsi="BRH Malayalam Extra" w:cs="BRH Malayalam Extra"/>
+                <w:color w:val="000000"/>
+                <w:sz w:val="32"/>
+                <w:szCs w:val="40"/>
+              </w:rPr>
+              <w:t>— | M£</w:t>
             </w:r>
             <w:r>
               <w:rPr>
@@ -17724,8 +18053,9 @@
                 <w:color w:val="000000"/>
                 <w:sz w:val="32"/>
                 <w:szCs w:val="40"/>
-              </w:rPr>
-              <w:t xml:space="preserve"> | GK—py(³§)qZyI |</w:t>
+                <w:highlight w:val="green"/>
+              </w:rPr>
+              <w:t xml:space="preserve"> |</w:t>
             </w:r>
           </w:p>
           <w:p>
@@ -17749,6 +18079,336 @@
                 <w:sz w:val="32"/>
                 <w:szCs w:val="40"/>
               </w:rPr>
+              <w:t>eky— M£t§</w:t>
+            </w:r>
+            <w:r>
+              <w:rPr>
+                <w:rFonts w:ascii="BRH Malayalam Extra" w:hAnsi="BRH Malayalam Extra" w:cs="BRH Malayalam Extra"/>
+                <w:color w:val="000000"/>
+                <w:sz w:val="32"/>
+                <w:szCs w:val="40"/>
+                <w:highlight w:val="green"/>
+              </w:rPr>
+              <w:t>Yx</w:t>
+            </w:r>
+            <w:r>
+              <w:rPr>
+                <w:rFonts w:ascii="BRH Malayalam Extra" w:hAnsi="BRH Malayalam Extra" w:cs="BRH Malayalam Extra"/>
+                <w:color w:val="000000"/>
+                <w:sz w:val="32"/>
+                <w:szCs w:val="40"/>
+              </w:rPr>
+              <w:t xml:space="preserve">Zy </w:t>
+            </w:r>
+            <w:r>
+              <w:rPr>
+                <w:rFonts w:ascii="BRH Malayalam Extra" w:hAnsi="BRH Malayalam Extra" w:cs="BRH Malayalam Extra"/>
+                <w:color w:val="000000"/>
+                <w:sz w:val="32"/>
+                <w:szCs w:val="40"/>
+                <w:highlight w:val="green"/>
+              </w:rPr>
+              <w:t>M£t§YxZy</w:t>
+            </w:r>
+            <w:r>
+              <w:rPr>
+                <w:rFonts w:ascii="BRH Malayalam Extra" w:hAnsi="BRH Malayalam Extra" w:cs="BRH Malayalam Extra"/>
+                <w:color w:val="000000"/>
+                <w:sz w:val="26"/>
+                <w:szCs w:val="40"/>
+              </w:rPr>
+              <w:t>–</w:t>
+            </w:r>
+            <w:r>
+              <w:rPr>
+                <w:rFonts w:ascii="BRH Malayalam Extra" w:hAnsi="BRH Malayalam Extra" w:cs="BRH Malayalam Extra"/>
+                <w:color w:val="000000"/>
+                <w:sz w:val="32"/>
+                <w:szCs w:val="40"/>
+              </w:rPr>
+              <w:t xml:space="preserve"> eky</w:t>
+            </w:r>
+            <w:r>
+              <w:rPr>
+                <w:rFonts w:ascii="BRH Malayalam Extra" w:hAnsi="BRH Malayalam Extra" w:cs="BRH Malayalam Extra"/>
+                <w:color w:val="000000"/>
+                <w:sz w:val="26"/>
+                <w:szCs w:val="40"/>
+              </w:rPr>
+              <w:t>–</w:t>
+            </w:r>
+            <w:r>
+              <w:rPr>
+                <w:rFonts w:ascii="BRH Malayalam Extra" w:hAnsi="BRH Malayalam Extra" w:cs="BRH Malayalam Extra"/>
+                <w:color w:val="000000"/>
+                <w:sz w:val="32"/>
+                <w:szCs w:val="40"/>
+              </w:rPr>
+              <w:t xml:space="preserve"> eky— M£t§</w:t>
+            </w:r>
+            <w:r>
+              <w:rPr>
+                <w:rFonts w:ascii="BRH Malayalam Extra" w:hAnsi="BRH Malayalam Extra" w:cs="BRH Malayalam Extra"/>
+                <w:color w:val="000000"/>
+                <w:sz w:val="32"/>
+                <w:szCs w:val="40"/>
+                <w:highlight w:val="green"/>
+              </w:rPr>
+              <w:t>Yx</w:t>
+            </w:r>
+            <w:r>
+              <w:rPr>
+                <w:rFonts w:ascii="BRH Malayalam Extra" w:hAnsi="BRH Malayalam Extra" w:cs="BRH Malayalam Extra"/>
+                <w:color w:val="000000"/>
+                <w:sz w:val="32"/>
+                <w:szCs w:val="40"/>
+              </w:rPr>
+              <w:t xml:space="preserve">Zy | </w:t>
+            </w:r>
+          </w:p>
+          <w:p>
+            <w:pPr>
+              <w:widowControl w:val="0"/>
+              <w:autoSpaceDE w:val="0"/>
+              <w:autoSpaceDN w:val="0"/>
+              <w:adjustRightInd w:val="0"/>
+              <w:spacing w:before="0" w:line="240" w:lineRule="auto"/>
+              <w:rPr>
+                <w:rFonts w:ascii="BRH Malayalam Extra" w:hAnsi="BRH Malayalam Extra" w:cs="BRH Malayalam Extra"/>
+                <w:color w:val="000000"/>
+                <w:sz w:val="32"/>
+                <w:szCs w:val="40"/>
+              </w:rPr>
+            </w:pPr>
+            <w:r>
+              <w:rPr>
+                <w:rFonts w:cs="BRH Malayalam Extra"/>
+                <w:color w:val="000000"/>
+                <w:szCs w:val="40"/>
+              </w:rPr>
+              <w:t>48</w:t>
+            </w:r>
+            <w:r>
+              <w:rPr>
+                <w:rFonts w:ascii="BRH Malayalam Extra" w:hAnsi="BRH Malayalam Extra" w:cs="BRH Malayalam Extra"/>
+                <w:color w:val="000000"/>
+                <w:sz w:val="32"/>
+                <w:szCs w:val="40"/>
+              </w:rPr>
+              <w:t>)</w:t>
+            </w:r>
+            <w:r>
+              <w:rPr>
+                <w:rFonts w:ascii="BRH Malayalam Extra" w:hAnsi="BRH Malayalam Extra" w:cs="BRH Malayalam Extra"/>
+                <w:color w:val="000000"/>
+                <w:sz w:val="32"/>
+                <w:szCs w:val="40"/>
+              </w:rPr>
+              <w:tab/>
+            </w:r>
+            <w:r>
+              <w:rPr>
+                <w:rFonts w:cs="BRH Malayalam Extra"/>
+                <w:color w:val="000000"/>
+                <w:szCs w:val="40"/>
+              </w:rPr>
+              <w:t>2</w:t>
+            </w:r>
+            <w:r>
+              <w:rPr>
+                <w:rFonts w:ascii="BRH Malayalam Extra" w:hAnsi="BRH Malayalam Extra" w:cs="BRH Malayalam Extra"/>
+                <w:color w:val="000000"/>
+                <w:sz w:val="32"/>
+                <w:szCs w:val="40"/>
+              </w:rPr>
+              <w:t>.</w:t>
+            </w:r>
+            <w:r>
+              <w:rPr>
+                <w:rFonts w:cs="BRH Malayalam Extra"/>
+                <w:color w:val="000000"/>
+                <w:szCs w:val="40"/>
+              </w:rPr>
+              <w:t>5</w:t>
+            </w:r>
+            <w:r>
+              <w:rPr>
+                <w:rFonts w:ascii="BRH Malayalam Extra" w:hAnsi="BRH Malayalam Extra" w:cs="BRH Malayalam Extra"/>
+                <w:color w:val="000000"/>
+                <w:sz w:val="32"/>
+                <w:szCs w:val="40"/>
+              </w:rPr>
+              <w:t>.</w:t>
+            </w:r>
+            <w:r>
+              <w:rPr>
+                <w:rFonts w:cs="BRH Malayalam Extra"/>
+                <w:color w:val="000000"/>
+                <w:szCs w:val="40"/>
+              </w:rPr>
+              <w:t>10</w:t>
+            </w:r>
+            <w:r>
+              <w:rPr>
+                <w:rFonts w:ascii="BRH Malayalam Extra" w:hAnsi="BRH Malayalam Extra" w:cs="BRH Malayalam Extra"/>
+                <w:color w:val="000000"/>
+                <w:sz w:val="32"/>
+                <w:szCs w:val="40"/>
+              </w:rPr>
+              <w:t>.</w:t>
+            </w:r>
+            <w:r>
+              <w:rPr>
+                <w:rFonts w:cs="BRH Malayalam Extra"/>
+                <w:color w:val="000000"/>
+                <w:szCs w:val="40"/>
+              </w:rPr>
+              <w:t>2</w:t>
+            </w:r>
+            <w:r>
+              <w:rPr>
+                <w:rFonts w:ascii="BRH Malayalam Extra" w:hAnsi="BRH Malayalam Extra" w:cs="BRH Malayalam Extra"/>
+                <w:color w:val="000000"/>
+                <w:sz w:val="32"/>
+                <w:szCs w:val="40"/>
+              </w:rPr>
+              <w:t>(</w:t>
+            </w:r>
+            <w:r>
+              <w:rPr>
+                <w:rFonts w:cs="BRH Malayalam Extra"/>
+                <w:color w:val="000000"/>
+                <w:szCs w:val="40"/>
+              </w:rPr>
+              <w:t>42</w:t>
+            </w:r>
+            <w:r>
+              <w:rPr>
+                <w:rFonts w:ascii="BRH Malayalam Extra" w:hAnsi="BRH Malayalam Extra" w:cs="BRH Malayalam Extra"/>
+                <w:color w:val="000000"/>
+                <w:sz w:val="32"/>
+                <w:szCs w:val="40"/>
+              </w:rPr>
+              <w:t>)</w:t>
+            </w:r>
+            <w:proofErr w:type="gramStart"/>
+            <w:r>
+              <w:rPr>
+                <w:rFonts w:ascii="BRH Malayalam Extra" w:hAnsi="BRH Malayalam Extra" w:cs="BRH Malayalam Extra"/>
+                <w:color w:val="000000"/>
+                <w:sz w:val="32"/>
+                <w:szCs w:val="40"/>
+              </w:rPr>
+              <w:t>-  M</w:t>
+            </w:r>
+            <w:proofErr w:type="gramEnd"/>
+            <w:r>
+              <w:rPr>
+                <w:rFonts w:ascii="BRH Malayalam Extra" w:hAnsi="BRH Malayalam Extra" w:cs="BRH Malayalam Extra"/>
+                <w:color w:val="000000"/>
+                <w:sz w:val="32"/>
+                <w:szCs w:val="40"/>
+              </w:rPr>
+              <w:t>£</w:t>
+            </w:r>
+            <w:r>
+              <w:rPr>
+                <w:rFonts w:ascii="BRH Malayalam Extra" w:hAnsi="BRH Malayalam Extra" w:cs="BRH Malayalam Extra"/>
+                <w:color w:val="000000"/>
+                <w:sz w:val="26"/>
+                <w:szCs w:val="40"/>
+              </w:rPr>
+              <w:t>–</w:t>
+            </w:r>
+            <w:r>
+              <w:rPr>
+                <w:rFonts w:ascii="BRH Malayalam Extra" w:hAnsi="BRH Malayalam Extra" w:cs="BRH Malayalam Extra"/>
+                <w:color w:val="000000"/>
+                <w:sz w:val="32"/>
+                <w:szCs w:val="40"/>
+              </w:rPr>
+              <w:t>t§Yx</w:t>
+            </w:r>
+            <w:r>
+              <w:rPr>
+                <w:rFonts w:ascii="BRH Malayalam Extra" w:hAnsi="BRH Malayalam Extra" w:cs="BRH Malayalam Extra"/>
+                <w:color w:val="000000"/>
+                <w:sz w:val="26"/>
+                <w:szCs w:val="40"/>
+              </w:rPr>
+              <w:t>–</w:t>
+            </w:r>
+            <w:r>
+              <w:rPr>
+                <w:rFonts w:ascii="BRH Malayalam Extra" w:hAnsi="BRH Malayalam Extra" w:cs="BRH Malayalam Extra"/>
+                <w:color w:val="000000"/>
+                <w:sz w:val="32"/>
+                <w:szCs w:val="40"/>
+                <w:highlight w:val="green"/>
+              </w:rPr>
+              <w:t>Zy</w:t>
+            </w:r>
+            <w:r>
+              <w:rPr>
+                <w:rFonts w:ascii="BRH Malayalam Extra" w:hAnsi="BRH Malayalam Extra" w:cs="BRH Malayalam Extra"/>
+                <w:color w:val="000000"/>
+                <w:sz w:val="26"/>
+                <w:szCs w:val="40"/>
+                <w:highlight w:val="green"/>
+              </w:rPr>
+              <w:t>–</w:t>
+            </w:r>
+            <w:r>
+              <w:rPr>
+                <w:rFonts w:ascii="BRH Malayalam Extra" w:hAnsi="BRH Malayalam Extra" w:cs="BRH Malayalam Extra"/>
+                <w:color w:val="000000"/>
+                <w:sz w:val="32"/>
+                <w:szCs w:val="40"/>
+              </w:rPr>
+              <w:t xml:space="preserve"> | GK—py(³</w:t>
+            </w:r>
+            <w:proofErr w:type="gramStart"/>
+            <w:r>
+              <w:rPr>
+                <w:rFonts w:ascii="BRH Malayalam Extra" w:hAnsi="BRH Malayalam Extra" w:cs="BRH Malayalam Extra"/>
+                <w:color w:val="000000"/>
+                <w:sz w:val="32"/>
+                <w:szCs w:val="40"/>
+              </w:rPr>
+              <w:t>§)qZyI</w:t>
+            </w:r>
+            <w:proofErr w:type="gramEnd"/>
+            <w:r>
+              <w:rPr>
+                <w:rFonts w:ascii="BRH Malayalam Extra" w:hAnsi="BRH Malayalam Extra" w:cs="BRH Malayalam Extra"/>
+                <w:color w:val="000000"/>
+                <w:sz w:val="32"/>
+                <w:szCs w:val="40"/>
+              </w:rPr>
+              <w:t xml:space="preserve"> |</w:t>
+            </w:r>
+          </w:p>
+          <w:p>
+            <w:pPr>
+              <w:widowControl w:val="0"/>
+              <w:autoSpaceDE w:val="0"/>
+              <w:autoSpaceDN w:val="0"/>
+              <w:adjustRightInd w:val="0"/>
+              <w:spacing w:before="0" w:line="240" w:lineRule="auto"/>
+              <w:rPr>
+                <w:rFonts w:ascii="BRH Malayalam Extra" w:hAnsi="BRH Malayalam Extra" w:cs="BRH Malayalam Extra"/>
+                <w:color w:val="000000"/>
+                <w:sz w:val="32"/>
+                <w:szCs w:val="40"/>
+              </w:rPr>
+            </w:pPr>
+            <w:r>
+              <w:rPr>
+                <w:rFonts w:ascii="BRH Malayalam Extra" w:hAnsi="BRH Malayalam Extra" w:cs="BRH Malayalam Extra"/>
+                <w:color w:val="000000"/>
+                <w:sz w:val="32"/>
+                <w:szCs w:val="40"/>
+              </w:rPr>
               <w:t>M£</w:t>
             </w:r>
             <w:r>
@@ -17785,25 +18445,56 @@
                 <w:sz w:val="32"/>
                 <w:szCs w:val="40"/>
               </w:rPr>
-              <w:t xml:space="preserve"> ¥ZõK—py(³§)qZy</w:t>
-            </w:r>
-            <w:r>
-              <w:rPr>
-                <w:rFonts w:ascii="BRH Malayalam Extra" w:hAnsi="BRH Malayalam Extra" w:cs="BRH Malayalam Extra"/>
-                <w:color w:val="000000"/>
-                <w:sz w:val="26"/>
-                <w:szCs w:val="40"/>
-              </w:rPr>
-              <w:t>–</w:t>
-            </w:r>
-            <w:r>
-              <w:rPr>
-                <w:rFonts w:ascii="BRH Malayalam Extra" w:hAnsi="BRH Malayalam Extra" w:cs="BRH Malayalam Extra"/>
-                <w:color w:val="000000"/>
-                <w:sz w:val="32"/>
-                <w:szCs w:val="40"/>
-              </w:rPr>
-              <w:t xml:space="preserve"> ¥iK—py(³§)qZyI M£t§</w:t>
+              <w:t xml:space="preserve"> ¥ZõK—py(³</w:t>
+            </w:r>
+            <w:proofErr w:type="gramStart"/>
+            <w:r>
+              <w:rPr>
+                <w:rFonts w:ascii="BRH Malayalam Extra" w:hAnsi="BRH Malayalam Extra" w:cs="BRH Malayalam Extra"/>
+                <w:color w:val="000000"/>
+                <w:sz w:val="32"/>
+                <w:szCs w:val="40"/>
+              </w:rPr>
+              <w:t>§)qZy</w:t>
+            </w:r>
+            <w:proofErr w:type="gramEnd"/>
+            <w:r>
+              <w:rPr>
+                <w:rFonts w:ascii="BRH Malayalam Extra" w:hAnsi="BRH Malayalam Extra" w:cs="BRH Malayalam Extra"/>
+                <w:color w:val="000000"/>
+                <w:sz w:val="26"/>
+                <w:szCs w:val="40"/>
+              </w:rPr>
+              <w:t>–</w:t>
+            </w:r>
+            <w:r>
+              <w:rPr>
+                <w:rFonts w:ascii="BRH Malayalam Extra" w:hAnsi="BRH Malayalam Extra" w:cs="BRH Malayalam Extra"/>
+                <w:color w:val="000000"/>
+                <w:sz w:val="32"/>
+                <w:szCs w:val="40"/>
+              </w:rPr>
+              <w:t xml:space="preserve"> ¥iK—py(³</w:t>
+            </w:r>
+            <w:proofErr w:type="gramStart"/>
+            <w:r>
+              <w:rPr>
+                <w:rFonts w:ascii="BRH Malayalam Extra" w:hAnsi="BRH Malayalam Extra" w:cs="BRH Malayalam Extra"/>
+                <w:color w:val="000000"/>
+                <w:sz w:val="32"/>
+                <w:szCs w:val="40"/>
+              </w:rPr>
+              <w:t>§)qZyI</w:t>
+            </w:r>
+            <w:proofErr w:type="gramEnd"/>
+            <w:r>
+              <w:rPr>
+                <w:rFonts w:ascii="BRH Malayalam Extra" w:hAnsi="BRH Malayalam Extra" w:cs="BRH Malayalam Extra"/>
+                <w:color w:val="000000"/>
+                <w:sz w:val="32"/>
+                <w:szCs w:val="40"/>
+              </w:rPr>
+              <w:t xml:space="preserve"> M£t§</w:t>
             </w:r>
             <w:r>
               <w:rPr>
@@ -17859,7 +18550,27 @@
                 <w:sz w:val="32"/>
                 <w:szCs w:val="40"/>
               </w:rPr>
-              <w:t xml:space="preserve"> ¥ZõK—py(³§)qZyI | </w:t>
+              <w:t xml:space="preserve"> ¥ZõK—py(³</w:t>
+            </w:r>
+            <w:proofErr w:type="gramStart"/>
+            <w:r>
+              <w:rPr>
+                <w:rFonts w:ascii="BRH Malayalam Extra" w:hAnsi="BRH Malayalam Extra" w:cs="BRH Malayalam Extra"/>
+                <w:color w:val="000000"/>
+                <w:sz w:val="32"/>
+                <w:szCs w:val="40"/>
+              </w:rPr>
+              <w:t>§)qZyI</w:t>
+            </w:r>
+            <w:proofErr w:type="gramEnd"/>
+            <w:r>
+              <w:rPr>
+                <w:rFonts w:ascii="BRH Malayalam Extra" w:hAnsi="BRH Malayalam Extra" w:cs="BRH Malayalam Extra"/>
+                <w:color w:val="000000"/>
+                <w:sz w:val="32"/>
+                <w:szCs w:val="40"/>
+              </w:rPr>
+              <w:t xml:space="preserve"> | </w:t>
             </w:r>
           </w:p>
           <w:p>
@@ -18016,7 +18727,27 @@
                 <w:sz w:val="32"/>
                 <w:szCs w:val="40"/>
               </w:rPr>
-              <w:t>)-  ög¢</w:t>
+              <w:t>)</w:t>
+            </w:r>
+            <w:proofErr w:type="gramStart"/>
+            <w:r>
+              <w:rPr>
+                <w:rFonts w:ascii="BRH Malayalam Extra" w:hAnsi="BRH Malayalam Extra" w:cs="BRH Malayalam Extra"/>
+                <w:color w:val="000000"/>
+                <w:sz w:val="32"/>
+                <w:szCs w:val="40"/>
+              </w:rPr>
+              <w:t>-  ög</w:t>
+            </w:r>
+            <w:proofErr w:type="gramEnd"/>
+            <w:r>
+              <w:rPr>
+                <w:rFonts w:ascii="BRH Malayalam Extra" w:hAnsi="BRH Malayalam Extra" w:cs="BRH Malayalam Extra"/>
+                <w:color w:val="000000"/>
+                <w:sz w:val="32"/>
+                <w:szCs w:val="40"/>
+              </w:rPr>
+              <w:t>¢</w:t>
             </w:r>
             <w:r>
               <w:rPr>
@@ -18423,7 +19154,29 @@
                 <w:szCs w:val="40"/>
                 <w:lang w:val="en-IN"/>
               </w:rPr>
-              <w:t>)-  Ae—kyiy</w:t>
+              <w:t>)</w:t>
+            </w:r>
+            <w:proofErr w:type="gramStart"/>
+            <w:r>
+              <w:rPr>
+                <w:rFonts w:ascii="BRH Malayalam Extra" w:hAnsi="BRH Malayalam Extra" w:cs="BRH Malayalam Extra"/>
+                <w:color w:val="000000"/>
+                <w:sz w:val="32"/>
+                <w:szCs w:val="40"/>
+                <w:lang w:val="en-IN"/>
+              </w:rPr>
+              <w:t>-  Ae</w:t>
+            </w:r>
+            <w:proofErr w:type="gramEnd"/>
+            <w:r>
+              <w:rPr>
+                <w:rFonts w:ascii="BRH Malayalam Extra" w:hAnsi="BRH Malayalam Extra" w:cs="BRH Malayalam Extra"/>
+                <w:color w:val="000000"/>
+                <w:sz w:val="32"/>
+                <w:szCs w:val="40"/>
+                <w:lang w:val="en-IN"/>
+              </w:rPr>
+              <w:t>—kyiy</w:t>
             </w:r>
             <w:r>
               <w:rPr>
@@ -18720,7 +19473,29 @@
                 <w:szCs w:val="40"/>
                 <w:lang w:val="en-IN"/>
               </w:rPr>
-              <w:t>)-  Ae—kyiy</w:t>
+              <w:t>)</w:t>
+            </w:r>
+            <w:proofErr w:type="gramStart"/>
+            <w:r>
+              <w:rPr>
+                <w:rFonts w:ascii="BRH Malayalam Extra" w:hAnsi="BRH Malayalam Extra" w:cs="BRH Malayalam Extra"/>
+                <w:color w:val="000000"/>
+                <w:sz w:val="32"/>
+                <w:szCs w:val="40"/>
+                <w:lang w:val="en-IN"/>
+              </w:rPr>
+              <w:t>-  Ae</w:t>
+            </w:r>
+            <w:proofErr w:type="gramEnd"/>
+            <w:r>
+              <w:rPr>
+                <w:rFonts w:ascii="BRH Malayalam Extra" w:hAnsi="BRH Malayalam Extra" w:cs="BRH Malayalam Extra"/>
+                <w:color w:val="000000"/>
+                <w:sz w:val="32"/>
+                <w:szCs w:val="40"/>
+                <w:lang w:val="en-IN"/>
+              </w:rPr>
+              <w:t>—kyiy</w:t>
             </w:r>
             <w:r>
               <w:rPr>
@@ -19007,7 +19782,29 @@
                 <w:szCs w:val="40"/>
                 <w:lang w:val="en-IN"/>
               </w:rPr>
-              <w:t>)-  ög¢</w:t>
+              <w:t>)</w:t>
+            </w:r>
+            <w:proofErr w:type="gramStart"/>
+            <w:r>
+              <w:rPr>
+                <w:rFonts w:ascii="BRH Malayalam Extra" w:hAnsi="BRH Malayalam Extra" w:cs="BRH Malayalam Extra"/>
+                <w:color w:val="000000"/>
+                <w:sz w:val="32"/>
+                <w:szCs w:val="40"/>
+                <w:lang w:val="en-IN"/>
+              </w:rPr>
+              <w:t>-  ög</w:t>
+            </w:r>
+            <w:proofErr w:type="gramEnd"/>
+            <w:r>
+              <w:rPr>
+                <w:rFonts w:ascii="BRH Malayalam Extra" w:hAnsi="BRH Malayalam Extra" w:cs="BRH Malayalam Extra"/>
+                <w:color w:val="000000"/>
+                <w:sz w:val="32"/>
+                <w:szCs w:val="40"/>
+                <w:lang w:val="en-IN"/>
+              </w:rPr>
+              <w:t>¢</w:t>
             </w:r>
             <w:r>
               <w:rPr>
@@ -19403,7 +20200,29 @@
                 <w:szCs w:val="40"/>
                 <w:lang w:val="en-IN"/>
               </w:rPr>
-              <w:t>)-  Ae—kyiy</w:t>
+              <w:t>)</w:t>
+            </w:r>
+            <w:proofErr w:type="gramStart"/>
+            <w:r>
+              <w:rPr>
+                <w:rFonts w:ascii="BRH Malayalam Extra" w:hAnsi="BRH Malayalam Extra" w:cs="BRH Malayalam Extra"/>
+                <w:color w:val="000000"/>
+                <w:sz w:val="32"/>
+                <w:szCs w:val="40"/>
+                <w:lang w:val="en-IN"/>
+              </w:rPr>
+              <w:t>-  Ae</w:t>
+            </w:r>
+            <w:proofErr w:type="gramEnd"/>
+            <w:r>
+              <w:rPr>
+                <w:rFonts w:ascii="BRH Malayalam Extra" w:hAnsi="BRH Malayalam Extra" w:cs="BRH Malayalam Extra"/>
+                <w:color w:val="000000"/>
+                <w:sz w:val="32"/>
+                <w:szCs w:val="40"/>
+                <w:lang w:val="en-IN"/>
+              </w:rPr>
+              <w:t>—kyiy</w:t>
             </w:r>
             <w:r>
               <w:rPr>
@@ -19690,7 +20509,29 @@
                 <w:szCs w:val="40"/>
                 <w:lang w:val="en-IN"/>
               </w:rPr>
-              <w:t>)-  Ae—kyiy</w:t>
+              <w:t>)</w:t>
+            </w:r>
+            <w:proofErr w:type="gramStart"/>
+            <w:r>
+              <w:rPr>
+                <w:rFonts w:ascii="BRH Malayalam Extra" w:hAnsi="BRH Malayalam Extra" w:cs="BRH Malayalam Extra"/>
+                <w:color w:val="000000"/>
+                <w:sz w:val="32"/>
+                <w:szCs w:val="40"/>
+                <w:lang w:val="en-IN"/>
+              </w:rPr>
+              <w:t>-  Ae</w:t>
+            </w:r>
+            <w:proofErr w:type="gramEnd"/>
+            <w:r>
+              <w:rPr>
+                <w:rFonts w:ascii="BRH Malayalam Extra" w:hAnsi="BRH Malayalam Extra" w:cs="BRH Malayalam Extra"/>
+                <w:color w:val="000000"/>
+                <w:sz w:val="32"/>
+                <w:szCs w:val="40"/>
+                <w:lang w:val="en-IN"/>
+              </w:rPr>
+              <w:t>—kyiy</w:t>
             </w:r>
             <w:r>
               <w:rPr>
@@ -19965,7 +20806,27 @@
                 <w:sz w:val="32"/>
                 <w:szCs w:val="40"/>
               </w:rPr>
-              <w:t>)-  B | A</w:t>
+              <w:t>)</w:t>
+            </w:r>
+            <w:proofErr w:type="gramStart"/>
+            <w:r>
+              <w:rPr>
+                <w:rFonts w:ascii="BRH Malayalam Extra" w:hAnsi="BRH Malayalam Extra" w:cs="BRH Malayalam Extra"/>
+                <w:color w:val="000000"/>
+                <w:sz w:val="32"/>
+                <w:szCs w:val="40"/>
+              </w:rPr>
+              <w:t>-  B</w:t>
+            </w:r>
+            <w:proofErr w:type="gramEnd"/>
+            <w:r>
+              <w:rPr>
+                <w:rFonts w:ascii="BRH Malayalam Extra" w:hAnsi="BRH Malayalam Extra" w:cs="BRH Malayalam Extra"/>
+                <w:color w:val="000000"/>
+                <w:sz w:val="32"/>
+                <w:szCs w:val="40"/>
+              </w:rPr>
+              <w:t xml:space="preserve"> | A</w:t>
             </w:r>
             <w:r>
               <w:rPr>
@@ -20225,12 +21086,28 @@
                 <w:szCs w:val="40"/>
               </w:rPr>
             </w:pPr>
-            <w:r>
-              <w:rPr>
-                <w:rFonts w:cs="BRH Malayalam Extra"/>
-                <w:color w:val="000000"/>
-                <w:szCs w:val="40"/>
-              </w:rPr>
+          </w:p>
+          <w:p>
+            <w:pPr>
+              <w:widowControl w:val="0"/>
+              <w:autoSpaceDE w:val="0"/>
+              <w:autoSpaceDN w:val="0"/>
+              <w:adjustRightInd w:val="0"/>
+              <w:spacing w:before="0" w:line="240" w:lineRule="auto"/>
+              <w:rPr>
+                <w:rFonts w:ascii="BRH Malayalam Extra" w:hAnsi="BRH Malayalam Extra" w:cs="BRH Malayalam Extra"/>
+                <w:color w:val="000000"/>
+                <w:sz w:val="32"/>
+                <w:szCs w:val="40"/>
+              </w:rPr>
+            </w:pPr>
+            <w:r>
+              <w:rPr>
+                <w:rFonts w:cs="BRH Malayalam Extra"/>
+                <w:color w:val="000000"/>
+                <w:szCs w:val="40"/>
+              </w:rPr>
+              <w:lastRenderedPageBreak/>
               <w:t>27</w:t>
             </w:r>
             <w:r>
@@ -20334,8 +21211,19 @@
                 <w:sz w:val="32"/>
                 <w:szCs w:val="40"/>
               </w:rPr>
-              <w:t>)-  A</w:t>
-            </w:r>
+              <w:t>)</w:t>
+            </w:r>
+            <w:proofErr w:type="gramStart"/>
+            <w:r>
+              <w:rPr>
+                <w:rFonts w:ascii="BRH Malayalam Extra" w:hAnsi="BRH Malayalam Extra" w:cs="BRH Malayalam Extra"/>
+                <w:color w:val="000000"/>
+                <w:sz w:val="32"/>
+                <w:szCs w:val="40"/>
+              </w:rPr>
+              <w:t>-  A</w:t>
+            </w:r>
+            <w:proofErr w:type="gramEnd"/>
             <w:r>
               <w:rPr>
                 <w:rFonts w:ascii="BRH Malayalam Extra" w:hAnsi="BRH Malayalam Extra" w:cs="BRH Malayalam Extra"/>
@@ -20644,6 +21532,7 @@
                 <w:color w:val="000000"/>
                 <w:szCs w:val="40"/>
               </w:rPr>
+              <w:lastRenderedPageBreak/>
               <w:t>26</w:t>
             </w:r>
             <w:r>
@@ -20747,7 +21636,27 @@
                 <w:sz w:val="32"/>
                 <w:szCs w:val="40"/>
               </w:rPr>
-              <w:t>)-  B | A</w:t>
+              <w:t>)</w:t>
+            </w:r>
+            <w:proofErr w:type="gramStart"/>
+            <w:r>
+              <w:rPr>
+                <w:rFonts w:ascii="BRH Malayalam Extra" w:hAnsi="BRH Malayalam Extra" w:cs="BRH Malayalam Extra"/>
+                <w:color w:val="000000"/>
+                <w:sz w:val="32"/>
+                <w:szCs w:val="40"/>
+              </w:rPr>
+              <w:t>-  B</w:t>
+            </w:r>
+            <w:proofErr w:type="gramEnd"/>
+            <w:r>
+              <w:rPr>
+                <w:rFonts w:ascii="BRH Malayalam Extra" w:hAnsi="BRH Malayalam Extra" w:cs="BRH Malayalam Extra"/>
+                <w:color w:val="000000"/>
+                <w:sz w:val="32"/>
+                <w:szCs w:val="40"/>
+              </w:rPr>
+              <w:t xml:space="preserve"> | A</w:t>
             </w:r>
             <w:r>
               <w:rPr>
@@ -20977,12 +21886,28 @@
                 <w:szCs w:val="40"/>
               </w:rPr>
             </w:pPr>
-            <w:r>
-              <w:rPr>
-                <w:rFonts w:cs="BRH Malayalam Extra"/>
-                <w:color w:val="000000"/>
-                <w:szCs w:val="40"/>
-              </w:rPr>
+          </w:p>
+          <w:p>
+            <w:pPr>
+              <w:widowControl w:val="0"/>
+              <w:autoSpaceDE w:val="0"/>
+              <w:autoSpaceDN w:val="0"/>
+              <w:adjustRightInd w:val="0"/>
+              <w:spacing w:before="0" w:line="240" w:lineRule="auto"/>
+              <w:rPr>
+                <w:rFonts w:ascii="BRH Malayalam Extra" w:hAnsi="BRH Malayalam Extra" w:cs="BRH Malayalam Extra"/>
+                <w:color w:val="000000"/>
+                <w:sz w:val="32"/>
+                <w:szCs w:val="40"/>
+              </w:rPr>
+            </w:pPr>
+            <w:r>
+              <w:rPr>
+                <w:rFonts w:cs="BRH Malayalam Extra"/>
+                <w:color w:val="000000"/>
+                <w:szCs w:val="40"/>
+              </w:rPr>
+              <w:lastRenderedPageBreak/>
               <w:t>27</w:t>
             </w:r>
             <w:r>
@@ -21086,8 +22011,19 @@
                 <w:sz w:val="32"/>
                 <w:szCs w:val="40"/>
               </w:rPr>
-              <w:t>)-  A</w:t>
-            </w:r>
+              <w:t>)</w:t>
+            </w:r>
+            <w:proofErr w:type="gramStart"/>
+            <w:r>
+              <w:rPr>
+                <w:rFonts w:ascii="BRH Malayalam Extra" w:hAnsi="BRH Malayalam Extra" w:cs="BRH Malayalam Extra"/>
+                <w:color w:val="000000"/>
+                <w:sz w:val="32"/>
+                <w:szCs w:val="40"/>
+              </w:rPr>
+              <w:t>-  A</w:t>
+            </w:r>
+            <w:proofErr w:type="gramEnd"/>
             <w:r>
               <w:rPr>
                 <w:rFonts w:ascii="BRH Malayalam Extra" w:hAnsi="BRH Malayalam Extra" w:cs="BRH Malayalam Extra"/>
@@ -21507,7 +22443,27 @@
                 <w:sz w:val="32"/>
                 <w:szCs w:val="40"/>
               </w:rPr>
-              <w:t>)-  ¤¤p | öex</w:t>
+              <w:t>)</w:t>
+            </w:r>
+            <w:proofErr w:type="gramStart"/>
+            <w:r>
+              <w:rPr>
+                <w:rFonts w:ascii="BRH Malayalam Extra" w:hAnsi="BRH Malayalam Extra" w:cs="BRH Malayalam Extra"/>
+                <w:color w:val="000000"/>
+                <w:sz w:val="32"/>
+                <w:szCs w:val="40"/>
+              </w:rPr>
+              <w:t>-  ¤</w:t>
+            </w:r>
+            <w:proofErr w:type="gramEnd"/>
+            <w:r>
+              <w:rPr>
+                <w:rFonts w:ascii="BRH Malayalam Extra" w:hAnsi="BRH Malayalam Extra" w:cs="BRH Malayalam Extra"/>
+                <w:color w:val="000000"/>
+                <w:sz w:val="32"/>
+                <w:szCs w:val="40"/>
+              </w:rPr>
+              <w:t>¤p | öex</w:t>
             </w:r>
             <w:r>
               <w:rPr>
@@ -21770,8 +22726,19 @@
                 <w:sz w:val="32"/>
                 <w:szCs w:val="40"/>
               </w:rPr>
-              <w:t>)-  öex</w:t>
-            </w:r>
+              <w:t>)</w:t>
+            </w:r>
+            <w:proofErr w:type="gramStart"/>
+            <w:r>
+              <w:rPr>
+                <w:rFonts w:ascii="BRH Malayalam Extra" w:hAnsi="BRH Malayalam Extra" w:cs="BRH Malayalam Extra"/>
+                <w:color w:val="000000"/>
+                <w:sz w:val="32"/>
+                <w:szCs w:val="40"/>
+              </w:rPr>
+              <w:t>-  öex</w:t>
+            </w:r>
+            <w:proofErr w:type="gramEnd"/>
             <w:r>
               <w:rPr>
                 <w:rFonts w:ascii="BRH Malayalam Extra" w:hAnsi="BRH Malayalam Extra" w:cs="BRH Malayalam Extra"/>
@@ -22128,8 +23095,19 @@
                 <w:sz w:val="32"/>
                 <w:szCs w:val="40"/>
               </w:rPr>
-              <w:t>)-  öex</w:t>
-            </w:r>
+              <w:t>)</w:t>
+            </w:r>
+            <w:proofErr w:type="gramStart"/>
+            <w:r>
+              <w:rPr>
+                <w:rFonts w:ascii="BRH Malayalam Extra" w:hAnsi="BRH Malayalam Extra" w:cs="BRH Malayalam Extra"/>
+                <w:color w:val="000000"/>
+                <w:sz w:val="32"/>
+                <w:szCs w:val="40"/>
+              </w:rPr>
+              <w:t>-  öex</w:t>
+            </w:r>
+            <w:proofErr w:type="gramEnd"/>
             <w:r>
               <w:rPr>
                 <w:rFonts w:ascii="BRH Malayalam Extra" w:hAnsi="BRH Malayalam Extra" w:cs="BRH Malayalam Extra"/>
@@ -22352,7 +23330,27 @@
                 <w:sz w:val="32"/>
                 <w:szCs w:val="40"/>
               </w:rPr>
-              <w:t>)-  ¤¤p | öex</w:t>
+              <w:t>)</w:t>
+            </w:r>
+            <w:proofErr w:type="gramStart"/>
+            <w:r>
+              <w:rPr>
+                <w:rFonts w:ascii="BRH Malayalam Extra" w:hAnsi="BRH Malayalam Extra" w:cs="BRH Malayalam Extra"/>
+                <w:color w:val="000000"/>
+                <w:sz w:val="32"/>
+                <w:szCs w:val="40"/>
+              </w:rPr>
+              <w:t>-  ¤</w:t>
+            </w:r>
+            <w:proofErr w:type="gramEnd"/>
+            <w:r>
+              <w:rPr>
+                <w:rFonts w:ascii="BRH Malayalam Extra" w:hAnsi="BRH Malayalam Extra" w:cs="BRH Malayalam Extra"/>
+                <w:color w:val="000000"/>
+                <w:sz w:val="32"/>
+                <w:szCs w:val="40"/>
+              </w:rPr>
+              <w:t>¤p | öex</w:t>
             </w:r>
             <w:r>
               <w:rPr>
@@ -22615,8 +23613,19 @@
                 <w:sz w:val="32"/>
                 <w:szCs w:val="40"/>
               </w:rPr>
-              <w:t>)-  öex</w:t>
-            </w:r>
+              <w:t>)</w:t>
+            </w:r>
+            <w:proofErr w:type="gramStart"/>
+            <w:r>
+              <w:rPr>
+                <w:rFonts w:ascii="BRH Malayalam Extra" w:hAnsi="BRH Malayalam Extra" w:cs="BRH Malayalam Extra"/>
+                <w:color w:val="000000"/>
+                <w:sz w:val="32"/>
+                <w:szCs w:val="40"/>
+              </w:rPr>
+              <w:t>-  öex</w:t>
+            </w:r>
+            <w:proofErr w:type="gramEnd"/>
             <w:r>
               <w:rPr>
                 <w:rFonts w:ascii="BRH Malayalam Extra" w:hAnsi="BRH Malayalam Extra" w:cs="BRH Malayalam Extra"/>
@@ -22973,8 +23982,19 @@
                 <w:sz w:val="32"/>
                 <w:szCs w:val="40"/>
               </w:rPr>
-              <w:t>)-  öex</w:t>
-            </w:r>
+              <w:t>)</w:t>
+            </w:r>
+            <w:proofErr w:type="gramStart"/>
+            <w:r>
+              <w:rPr>
+                <w:rFonts w:ascii="BRH Malayalam Extra" w:hAnsi="BRH Malayalam Extra" w:cs="BRH Malayalam Extra"/>
+                <w:color w:val="000000"/>
+                <w:sz w:val="32"/>
+                <w:szCs w:val="40"/>
+              </w:rPr>
+              <w:t>-  öex</w:t>
+            </w:r>
+            <w:proofErr w:type="gramEnd"/>
             <w:r>
               <w:rPr>
                 <w:rFonts w:ascii="BRH Malayalam Extra" w:hAnsi="BRH Malayalam Extra" w:cs="BRH Malayalam Extra"/>
@@ -23202,8 +24222,19 @@
                 <w:sz w:val="32"/>
                 <w:szCs w:val="40"/>
               </w:rPr>
-              <w:t>)-  A</w:t>
-            </w:r>
+              <w:t>)</w:t>
+            </w:r>
+            <w:proofErr w:type="gramStart"/>
+            <w:r>
+              <w:rPr>
+                <w:rFonts w:ascii="BRH Malayalam Extra" w:hAnsi="BRH Malayalam Extra" w:cs="BRH Malayalam Extra"/>
+                <w:color w:val="000000"/>
+                <w:sz w:val="32"/>
+                <w:szCs w:val="40"/>
+              </w:rPr>
+              <w:t>-  A</w:t>
+            </w:r>
+            <w:proofErr w:type="gramEnd"/>
             <w:r>
               <w:rPr>
                 <w:rFonts w:ascii="BRH Malayalam Extra" w:hAnsi="BRH Malayalam Extra" w:cs="BRH Malayalam Extra"/>
@@ -23415,8 +24446,20 @@
                 <w:szCs w:val="40"/>
                 <w:highlight w:val="yellow"/>
               </w:rPr>
-              <w:t>¡¥P— „(³§)¥</w:t>
-            </w:r>
+              <w:t>¡¥P— „(³</w:t>
+            </w:r>
+            <w:proofErr w:type="gramStart"/>
+            <w:r>
+              <w:rPr>
+                <w:rFonts w:ascii="BRH Malayalam Extra" w:hAnsi="BRH Malayalam Extra" w:cs="BRH Malayalam Extra"/>
+                <w:color w:val="000000"/>
+                <w:sz w:val="32"/>
+                <w:szCs w:val="40"/>
+                <w:highlight w:val="yellow"/>
+              </w:rPr>
+              <w:t>§)¥</w:t>
+            </w:r>
+            <w:proofErr w:type="gramEnd"/>
             <w:r>
               <w:rPr>
                 <w:rFonts w:ascii="BRH Malayalam Extra" w:hAnsi="BRH Malayalam Extra" w:cs="BRH Malayalam Extra"/>
@@ -23597,8 +24640,19 @@
                 <w:sz w:val="32"/>
                 <w:szCs w:val="40"/>
               </w:rPr>
-              <w:t>)-  A</w:t>
-            </w:r>
+              <w:t>)</w:t>
+            </w:r>
+            <w:proofErr w:type="gramStart"/>
+            <w:r>
+              <w:rPr>
+                <w:rFonts w:ascii="BRH Malayalam Extra" w:hAnsi="BRH Malayalam Extra" w:cs="BRH Malayalam Extra"/>
+                <w:color w:val="000000"/>
+                <w:sz w:val="32"/>
+                <w:szCs w:val="40"/>
+              </w:rPr>
+              <w:t>-  A</w:t>
+            </w:r>
+            <w:proofErr w:type="gramEnd"/>
             <w:r>
               <w:rPr>
                 <w:rFonts w:ascii="BRH Malayalam Extra" w:hAnsi="BRH Malayalam Extra" w:cs="BRH Malayalam Extra"/>
@@ -23897,58 +24951,6 @@
         </w:rPr>
         <w:t>===========</w:t>
       </w:r>
-    </w:p>
-    <w:p>
-      <w:pPr>
-        <w:spacing w:before="0" w:line="240" w:lineRule="auto"/>
-        <w:jc w:val="center"/>
-        <w:rPr>
-          <w:b/>
-          <w:bCs/>
-          <w:sz w:val="32"/>
-          <w:szCs w:val="32"/>
-          <w:u w:val="single"/>
-        </w:rPr>
-      </w:pPr>
-    </w:p>
-    <w:p>
-      <w:pPr>
-        <w:spacing w:before="0" w:line="240" w:lineRule="auto"/>
-        <w:jc w:val="center"/>
-        <w:rPr>
-          <w:b/>
-          <w:bCs/>
-          <w:sz w:val="32"/>
-          <w:szCs w:val="32"/>
-          <w:u w:val="single"/>
-        </w:rPr>
-      </w:pPr>
-    </w:p>
-    <w:p>
-      <w:pPr>
-        <w:spacing w:before="0" w:line="240" w:lineRule="auto"/>
-        <w:jc w:val="center"/>
-        <w:rPr>
-          <w:b/>
-          <w:bCs/>
-          <w:sz w:val="32"/>
-          <w:szCs w:val="32"/>
-          <w:u w:val="single"/>
-        </w:rPr>
-      </w:pPr>
-    </w:p>
-    <w:p>
-      <w:pPr>
-        <w:spacing w:before="0" w:line="240" w:lineRule="auto"/>
-        <w:jc w:val="center"/>
-        <w:rPr>
-          <w:b/>
-          <w:bCs/>
-          <w:sz w:val="32"/>
-          <w:szCs w:val="32"/>
-          <w:u w:val="single"/>
-        </w:rPr>
-      </w:pPr>
     </w:p>
     <w:p>
       <w:pPr>
@@ -24416,7 +25418,7 @@
 </file>
 
 <file path=word/endnotes.xml><?xml version="1.0" encoding="utf-8"?>
-<w:endnotes xmlns:wpc="http://schemas.microsoft.com/office/word/2010/wordprocessingCanvas" xmlns:cx="http://schemas.microsoft.com/office/drawing/2014/chartex" xmlns:cx1="http://schemas.microsoft.com/office/drawing/2015/9/8/chartex" xmlns:cx2="http://schemas.microsoft.com/office/drawing/2015/10/21/chartex" xmlns:cx3="http://schemas.microsoft.com/office/drawing/2016/5/9/chartex" xmlns:cx4="http://schemas.microsoft.com/office/drawing/2016/5/10/chartex" xmlns:cx5="http://schemas.microsoft.com/office/drawing/2016/5/11/chartex" xmlns:cx6="http://schemas.microsoft.com/office/drawing/2016/5/12/chartex" xmlns:cx7="http://schemas.microsoft.com/office/drawing/2016/5/13/chartex" xmlns:cx8="http://schemas.microsoft.com/office/drawing/2016/5/14/chartex" xmlns:mc="http://schemas.openxmlformats.org/markup-compatibility/2006" xmlns:aink="http://schemas.microsoft.com/office/drawing/2016/ink" xmlns:am3d="http://schemas.microsoft.com/office/drawing/2017/model3d" xmlns:o="urn:schemas-microsoft-com:office:office" xmlns:oel="http://schemas.microsoft.com/office/2019/extlst" xmlns:r="http://schemas.openxmlformats.org/officeDocument/2006/relationships" xmlns:m="http://schemas.openxmlformats.org/officeDocument/2006/math" xmlns:v="urn:schemas-microsoft-com:vml" xmlns:wp14="http://schemas.microsoft.com/office/word/2010/wordprocessingDrawing" xmlns:wp="http://schemas.openxmlformats.org/drawingml/2006/wordprocessingDrawing" xmlns:w10="urn:schemas-microsoft-com:office:word" xmlns:w="http://schemas.openxmlformats.org/wordprocessingml/2006/main" xmlns:w14="http://schemas.microsoft.com/office/word/2010/wordml" xmlns:w15="http://schemas.microsoft.com/office/word/2012/wordml" xmlns:w16cex="http://schemas.microsoft.com/office/word/2018/wordml/cex" xmlns:w16cid="http://schemas.microsoft.com/office/word/2016/wordml/cid" xmlns:w16="http://schemas.microsoft.com/office/word/2018/wordml" xmlns:w16du="http://schemas.microsoft.com/office/word/2023/wordml/word16du" xmlns:w16sdtdh="http://schemas.microsoft.com/office/word/2020/wordml/sdtdatahash" xmlns:w16sdtfl="http://schemas.microsoft.com/office/word/2024/wordml/sdtformatlock" xmlns:w16se="http://schemas.microsoft.com/office/word/2015/wordml/symex" xmlns:wpg="http://schemas.microsoft.com/office/word/2010/wordprocessingGroup" xmlns:wpi="http://schemas.microsoft.com/office/word/2010/wordprocessingInk" xmlns:wne="http://schemas.microsoft.com/office/word/2006/wordml" xmlns:wps="http://schemas.microsoft.com/office/word/2010/wordprocessingShape" mc:Ignorable="w14 w15 w16se w16cid w16 w16cex w16sdtdh w16sdtfl w16du wp14">
+<w:endnotes xmlns:wpc="http://schemas.microsoft.com/office/word/2010/wordprocessingCanvas" xmlns:cx="http://schemas.microsoft.com/office/drawing/2014/chartex" xmlns:cx1="http://schemas.microsoft.com/office/drawing/2015/9/8/chartex" xmlns:cx2="http://schemas.microsoft.com/office/drawing/2015/10/21/chartex" xmlns:cx3="http://schemas.microsoft.com/office/drawing/2016/5/9/chartex" xmlns:cx4="http://schemas.microsoft.com/office/drawing/2016/5/10/chartex" xmlns:cx5="http://schemas.microsoft.com/office/drawing/2016/5/11/chartex" xmlns:cx6="http://schemas.microsoft.com/office/drawing/2016/5/12/chartex" xmlns:cx7="http://schemas.microsoft.com/office/drawing/2016/5/13/chartex" xmlns:cx8="http://schemas.microsoft.com/office/drawing/2016/5/14/chartex" xmlns:mc="http://schemas.openxmlformats.org/markup-compatibility/2006" xmlns:aink="http://schemas.microsoft.com/office/drawing/2016/ink" xmlns:am3d="http://schemas.microsoft.com/office/drawing/2017/model3d" xmlns:o="urn:schemas-microsoft-com:office:office" xmlns:oel="http://schemas.microsoft.com/office/2019/extlst" xmlns:r="http://schemas.openxmlformats.org/officeDocument/2006/relationships" xmlns:m="http://schemas.openxmlformats.org/officeDocument/2006/math" xmlns:v="urn:schemas-microsoft-com:vml" xmlns:wp14="http://schemas.microsoft.com/office/word/2010/wordprocessingDrawing" xmlns:wp="http://schemas.openxmlformats.org/drawingml/2006/wordprocessingDrawing" xmlns:w10="urn:schemas-microsoft-com:office:word" xmlns:w="http://schemas.openxmlformats.org/wordprocessingml/2006/main" xmlns:w14="http://schemas.microsoft.com/office/word/2010/wordml" xmlns:w15="http://schemas.microsoft.com/office/word/2012/wordml" xmlns:w16cei="http://schemas.microsoft.com/office/word/2026/wordml/cei" xmlns:w16cex="http://schemas.microsoft.com/office/word/2018/wordml/cex" xmlns:w16cid="http://schemas.microsoft.com/office/word/2016/wordml/cid" xmlns:w16="http://schemas.microsoft.com/office/word/2018/wordml" xmlns:w16du="http://schemas.microsoft.com/office/word/2023/wordml/word16du" xmlns:w16sdtdh="http://schemas.microsoft.com/office/word/2020/wordml/sdtdatahash" xmlns:w16sdtfl="http://schemas.microsoft.com/office/word/2024/wordml/sdtformatlock" xmlns:w16se="http://schemas.microsoft.com/office/word/2015/wordml/symex" xmlns:wpg="http://schemas.microsoft.com/office/word/2010/wordprocessingGroup" xmlns:wpi="http://schemas.microsoft.com/office/word/2010/wordprocessingInk" xmlns:wne="http://schemas.microsoft.com/office/word/2006/wordml" xmlns:wps="http://schemas.microsoft.com/office/word/2010/wordprocessingShape" mc:Ignorable="w14 w15 w16se w16cid w16 w16cex w16sdtdh w16sdtfl w16du wp14">
   <w:endnote w:type="separator" w:id="-1">
     <w:p>
       <w:pPr>
@@ -24441,7 +25443,7 @@
 </file>
 
 <file path=word/footer1.xml><?xml version="1.0" encoding="utf-8"?>
-<w:ftr xmlns:wpc="http://schemas.microsoft.com/office/word/2010/wordprocessingCanvas" xmlns:cx="http://schemas.microsoft.com/office/drawing/2014/chartex" xmlns:cx1="http://schemas.microsoft.com/office/drawing/2015/9/8/chartex" xmlns:cx2="http://schemas.microsoft.com/office/drawing/2015/10/21/chartex" xmlns:cx3="http://schemas.microsoft.com/office/drawing/2016/5/9/chartex" xmlns:cx4="http://schemas.microsoft.com/office/drawing/2016/5/10/chartex" xmlns:cx5="http://schemas.microsoft.com/office/drawing/2016/5/11/chartex" xmlns:cx6="http://schemas.microsoft.com/office/drawing/2016/5/12/chartex" xmlns:cx7="http://schemas.microsoft.com/office/drawing/2016/5/13/chartex" xmlns:cx8="http://schemas.microsoft.com/office/drawing/2016/5/14/chartex" xmlns:mc="http://schemas.openxmlformats.org/markup-compatibility/2006" xmlns:aink="http://schemas.microsoft.com/office/drawing/2016/ink" xmlns:am3d="http://schemas.microsoft.com/office/drawing/2017/model3d" xmlns:o="urn:schemas-microsoft-com:office:office" xmlns:oel="http://schemas.microsoft.com/office/2019/extlst" xmlns:r="http://schemas.openxmlformats.org/officeDocument/2006/relationships" xmlns:m="http://schemas.openxmlformats.org/officeDocument/2006/math" xmlns:v="urn:schemas-microsoft-com:vml" xmlns:wp14="http://schemas.microsoft.com/office/word/2010/wordprocessingDrawing" xmlns:wp="http://schemas.openxmlformats.org/drawingml/2006/wordprocessingDrawing" xmlns:w10="urn:schemas-microsoft-com:office:word" xmlns:w="http://schemas.openxmlformats.org/wordprocessingml/2006/main" xmlns:w14="http://schemas.microsoft.com/office/word/2010/wordml" xmlns:w15="http://schemas.microsoft.com/office/word/2012/wordml" xmlns:w16cex="http://schemas.microsoft.com/office/word/2018/wordml/cex" xmlns:w16cid="http://schemas.microsoft.com/office/word/2016/wordml/cid" xmlns:w16="http://schemas.microsoft.com/office/word/2018/wordml" xmlns:w16du="http://schemas.microsoft.com/office/word/2023/wordml/word16du" xmlns:w16sdtdh="http://schemas.microsoft.com/office/word/2020/wordml/sdtdatahash" xmlns:w16sdtfl="http://schemas.microsoft.com/office/word/2024/wordml/sdtformatlock" xmlns:w16se="http://schemas.microsoft.com/office/word/2015/wordml/symex" xmlns:wpg="http://schemas.microsoft.com/office/word/2010/wordprocessingGroup" xmlns:wpi="http://schemas.microsoft.com/office/word/2010/wordprocessingInk" xmlns:wne="http://schemas.microsoft.com/office/word/2006/wordml" xmlns:wps="http://schemas.microsoft.com/office/word/2010/wordprocessingShape" mc:Ignorable="w14 w15 w16se w16cid w16 w16cex w16sdtdh w16sdtfl w16du wp14">
+<w:ftr xmlns:wpc="http://schemas.microsoft.com/office/word/2010/wordprocessingCanvas" xmlns:cx="http://schemas.microsoft.com/office/drawing/2014/chartex" xmlns:cx1="http://schemas.microsoft.com/office/drawing/2015/9/8/chartex" xmlns:cx2="http://schemas.microsoft.com/office/drawing/2015/10/21/chartex" xmlns:cx3="http://schemas.microsoft.com/office/drawing/2016/5/9/chartex" xmlns:cx4="http://schemas.microsoft.com/office/drawing/2016/5/10/chartex" xmlns:cx5="http://schemas.microsoft.com/office/drawing/2016/5/11/chartex" xmlns:cx6="http://schemas.microsoft.com/office/drawing/2016/5/12/chartex" xmlns:cx7="http://schemas.microsoft.com/office/drawing/2016/5/13/chartex" xmlns:cx8="http://schemas.microsoft.com/office/drawing/2016/5/14/chartex" xmlns:mc="http://schemas.openxmlformats.org/markup-compatibility/2006" xmlns:aink="http://schemas.microsoft.com/office/drawing/2016/ink" xmlns:am3d="http://schemas.microsoft.com/office/drawing/2017/model3d" xmlns:o="urn:schemas-microsoft-com:office:office" xmlns:oel="http://schemas.microsoft.com/office/2019/extlst" xmlns:r="http://schemas.openxmlformats.org/officeDocument/2006/relationships" xmlns:m="http://schemas.openxmlformats.org/officeDocument/2006/math" xmlns:v="urn:schemas-microsoft-com:vml" xmlns:wp14="http://schemas.microsoft.com/office/word/2010/wordprocessingDrawing" xmlns:wp="http://schemas.openxmlformats.org/drawingml/2006/wordprocessingDrawing" xmlns:w10="urn:schemas-microsoft-com:office:word" xmlns:w="http://schemas.openxmlformats.org/wordprocessingml/2006/main" xmlns:w14="http://schemas.microsoft.com/office/word/2010/wordml" xmlns:w15="http://schemas.microsoft.com/office/word/2012/wordml" xmlns:w16cei="http://schemas.microsoft.com/office/word/2026/wordml/cei" xmlns:w16cex="http://schemas.microsoft.com/office/word/2018/wordml/cex" xmlns:w16cid="http://schemas.microsoft.com/office/word/2016/wordml/cid" xmlns:w16="http://schemas.microsoft.com/office/word/2018/wordml" xmlns:w16du="http://schemas.microsoft.com/office/word/2023/wordml/word16du" xmlns:w16sdtdh="http://schemas.microsoft.com/office/word/2020/wordml/sdtdatahash" xmlns:w16sdtfl="http://schemas.microsoft.com/office/word/2024/wordml/sdtformatlock" xmlns:w16se="http://schemas.microsoft.com/office/word/2015/wordml/symex" xmlns:wpg="http://schemas.microsoft.com/office/word/2010/wordprocessingGroup" xmlns:wpi="http://schemas.microsoft.com/office/word/2010/wordprocessingInk" xmlns:wne="http://schemas.microsoft.com/office/word/2006/wordml" xmlns:wps="http://schemas.microsoft.com/office/word/2010/wordprocessingShape" mc:Ignorable="w14 w15 w16se w16cid w16 w16cex w16sdtdh w16sdtfl w16du wp14">
   <w:p>
     <w:pPr>
       <w:pBdr>
@@ -24623,7 +25625,7 @@
 </file>
 
 <file path=word/footer2.xml><?xml version="1.0" encoding="utf-8"?>
-<w:ftr xmlns:wpc="http://schemas.microsoft.com/office/word/2010/wordprocessingCanvas" xmlns:cx="http://schemas.microsoft.com/office/drawing/2014/chartex" xmlns:cx1="http://schemas.microsoft.com/office/drawing/2015/9/8/chartex" xmlns:cx2="http://schemas.microsoft.com/office/drawing/2015/10/21/chartex" xmlns:cx3="http://schemas.microsoft.com/office/drawing/2016/5/9/chartex" xmlns:cx4="http://schemas.microsoft.com/office/drawing/2016/5/10/chartex" xmlns:cx5="http://schemas.microsoft.com/office/drawing/2016/5/11/chartex" xmlns:cx6="http://schemas.microsoft.com/office/drawing/2016/5/12/chartex" xmlns:cx7="http://schemas.microsoft.com/office/drawing/2016/5/13/chartex" xmlns:cx8="http://schemas.microsoft.com/office/drawing/2016/5/14/chartex" xmlns:mc="http://schemas.openxmlformats.org/markup-compatibility/2006" xmlns:aink="http://schemas.microsoft.com/office/drawing/2016/ink" xmlns:am3d="http://schemas.microsoft.com/office/drawing/2017/model3d" xmlns:o="urn:schemas-microsoft-com:office:office" xmlns:oel="http://schemas.microsoft.com/office/2019/extlst" xmlns:r="http://schemas.openxmlformats.org/officeDocument/2006/relationships" xmlns:m="http://schemas.openxmlformats.org/officeDocument/2006/math" xmlns:v="urn:schemas-microsoft-com:vml" xmlns:wp14="http://schemas.microsoft.com/office/word/2010/wordprocessingDrawing" xmlns:wp="http://schemas.openxmlformats.org/drawingml/2006/wordprocessingDrawing" xmlns:w10="urn:schemas-microsoft-com:office:word" xmlns:w="http://schemas.openxmlformats.org/wordprocessingml/2006/main" xmlns:w14="http://schemas.microsoft.com/office/word/2010/wordml" xmlns:w15="http://schemas.microsoft.com/office/word/2012/wordml" xmlns:w16cex="http://schemas.microsoft.com/office/word/2018/wordml/cex" xmlns:w16cid="http://schemas.microsoft.com/office/word/2016/wordml/cid" xmlns:w16="http://schemas.microsoft.com/office/word/2018/wordml" xmlns:w16du="http://schemas.microsoft.com/office/word/2023/wordml/word16du" xmlns:w16sdtdh="http://schemas.microsoft.com/office/word/2020/wordml/sdtdatahash" xmlns:w16sdtfl="http://schemas.microsoft.com/office/word/2024/wordml/sdtformatlock" xmlns:w16se="http://schemas.microsoft.com/office/word/2015/wordml/symex" xmlns:wpg="http://schemas.microsoft.com/office/word/2010/wordprocessingGroup" xmlns:wpi="http://schemas.microsoft.com/office/word/2010/wordprocessingInk" xmlns:wne="http://schemas.microsoft.com/office/word/2006/wordml" xmlns:wps="http://schemas.microsoft.com/office/word/2010/wordprocessingShape" mc:Ignorable="w14 w15 w16se w16cid w16 w16cex w16sdtdh w16sdtfl w16du wp14">
+<w:ftr xmlns:wpc="http://schemas.microsoft.com/office/word/2010/wordprocessingCanvas" xmlns:cx="http://schemas.microsoft.com/office/drawing/2014/chartex" xmlns:cx1="http://schemas.microsoft.com/office/drawing/2015/9/8/chartex" xmlns:cx2="http://schemas.microsoft.com/office/drawing/2015/10/21/chartex" xmlns:cx3="http://schemas.microsoft.com/office/drawing/2016/5/9/chartex" xmlns:cx4="http://schemas.microsoft.com/office/drawing/2016/5/10/chartex" xmlns:cx5="http://schemas.microsoft.com/office/drawing/2016/5/11/chartex" xmlns:cx6="http://schemas.microsoft.com/office/drawing/2016/5/12/chartex" xmlns:cx7="http://schemas.microsoft.com/office/drawing/2016/5/13/chartex" xmlns:cx8="http://schemas.microsoft.com/office/drawing/2016/5/14/chartex" xmlns:mc="http://schemas.openxmlformats.org/markup-compatibility/2006" xmlns:aink="http://schemas.microsoft.com/office/drawing/2016/ink" xmlns:am3d="http://schemas.microsoft.com/office/drawing/2017/model3d" xmlns:o="urn:schemas-microsoft-com:office:office" xmlns:oel="http://schemas.microsoft.com/office/2019/extlst" xmlns:r="http://schemas.openxmlformats.org/officeDocument/2006/relationships" xmlns:m="http://schemas.openxmlformats.org/officeDocument/2006/math" xmlns:v="urn:schemas-microsoft-com:vml" xmlns:wp14="http://schemas.microsoft.com/office/word/2010/wordprocessingDrawing" xmlns:wp="http://schemas.openxmlformats.org/drawingml/2006/wordprocessingDrawing" xmlns:w10="urn:schemas-microsoft-com:office:word" xmlns:w="http://schemas.openxmlformats.org/wordprocessingml/2006/main" xmlns:w14="http://schemas.microsoft.com/office/word/2010/wordml" xmlns:w15="http://schemas.microsoft.com/office/word/2012/wordml" xmlns:w16cei="http://schemas.microsoft.com/office/word/2026/wordml/cei" xmlns:w16cex="http://schemas.microsoft.com/office/word/2018/wordml/cex" xmlns:w16cid="http://schemas.microsoft.com/office/word/2016/wordml/cid" xmlns:w16="http://schemas.microsoft.com/office/word/2018/wordml" xmlns:w16du="http://schemas.microsoft.com/office/word/2023/wordml/word16du" xmlns:w16sdtdh="http://schemas.microsoft.com/office/word/2020/wordml/sdtdatahash" xmlns:w16sdtfl="http://schemas.microsoft.com/office/word/2024/wordml/sdtformatlock" xmlns:w16se="http://schemas.microsoft.com/office/word/2015/wordml/symex" xmlns:wpg="http://schemas.microsoft.com/office/word/2010/wordprocessingGroup" xmlns:wpi="http://schemas.microsoft.com/office/word/2010/wordprocessingInk" xmlns:wne="http://schemas.microsoft.com/office/word/2006/wordml" xmlns:wps="http://schemas.microsoft.com/office/word/2010/wordprocessingShape" mc:Ignorable="w14 w15 w16se w16cid w16 w16cex w16sdtdh w16sdtfl w16du wp14">
   <w:p>
     <w:pPr>
       <w:pBdr>
@@ -24829,7 +25831,7 @@
 </file>
 
 <file path=word/footnotes.xml><?xml version="1.0" encoding="utf-8"?>
-<w:footnotes xmlns:wpc="http://schemas.microsoft.com/office/word/2010/wordprocessingCanvas" xmlns:cx="http://schemas.microsoft.com/office/drawing/2014/chartex" xmlns:cx1="http://schemas.microsoft.com/office/drawing/2015/9/8/chartex" xmlns:cx2="http://schemas.microsoft.com/office/drawing/2015/10/21/chartex" xmlns:cx3="http://schemas.microsoft.com/office/drawing/2016/5/9/chartex" xmlns:cx4="http://schemas.microsoft.com/office/drawing/2016/5/10/chartex" xmlns:cx5="http://schemas.microsoft.com/office/drawing/2016/5/11/chartex" xmlns:cx6="http://schemas.microsoft.com/office/drawing/2016/5/12/chartex" xmlns:cx7="http://schemas.microsoft.com/office/drawing/2016/5/13/chartex" xmlns:cx8="http://schemas.microsoft.com/office/drawing/2016/5/14/chartex" xmlns:mc="http://schemas.openxmlformats.org/markup-compatibility/2006" xmlns:aink="http://schemas.microsoft.com/office/drawing/2016/ink" xmlns:am3d="http://schemas.microsoft.com/office/drawing/2017/model3d" xmlns:o="urn:schemas-microsoft-com:office:office" xmlns:oel="http://schemas.microsoft.com/office/2019/extlst" xmlns:r="http://schemas.openxmlformats.org/officeDocument/2006/relationships" xmlns:m="http://schemas.openxmlformats.org/officeDocument/2006/math" xmlns:v="urn:schemas-microsoft-com:vml" xmlns:wp14="http://schemas.microsoft.com/office/word/2010/wordprocessingDrawing" xmlns:wp="http://schemas.openxmlformats.org/drawingml/2006/wordprocessingDrawing" xmlns:w10="urn:schemas-microsoft-com:office:word" xmlns:w="http://schemas.openxmlformats.org/wordprocessingml/2006/main" xmlns:w14="http://schemas.microsoft.com/office/word/2010/wordml" xmlns:w15="http://schemas.microsoft.com/office/word/2012/wordml" xmlns:w16cex="http://schemas.microsoft.com/office/word/2018/wordml/cex" xmlns:w16cid="http://schemas.microsoft.com/office/word/2016/wordml/cid" xmlns:w16="http://schemas.microsoft.com/office/word/2018/wordml" xmlns:w16du="http://schemas.microsoft.com/office/word/2023/wordml/word16du" xmlns:w16sdtdh="http://schemas.microsoft.com/office/word/2020/wordml/sdtdatahash" xmlns:w16sdtfl="http://schemas.microsoft.com/office/word/2024/wordml/sdtformatlock" xmlns:w16se="http://schemas.microsoft.com/office/word/2015/wordml/symex" xmlns:wpg="http://schemas.microsoft.com/office/word/2010/wordprocessingGroup" xmlns:wpi="http://schemas.microsoft.com/office/word/2010/wordprocessingInk" xmlns:wne="http://schemas.microsoft.com/office/word/2006/wordml" xmlns:wps="http://schemas.microsoft.com/office/word/2010/wordprocessingShape" mc:Ignorable="w14 w15 w16se w16cid w16 w16cex w16sdtdh w16sdtfl w16du wp14">
+<w:footnotes xmlns:wpc="http://schemas.microsoft.com/office/word/2010/wordprocessingCanvas" xmlns:cx="http://schemas.microsoft.com/office/drawing/2014/chartex" xmlns:cx1="http://schemas.microsoft.com/office/drawing/2015/9/8/chartex" xmlns:cx2="http://schemas.microsoft.com/office/drawing/2015/10/21/chartex" xmlns:cx3="http://schemas.microsoft.com/office/drawing/2016/5/9/chartex" xmlns:cx4="http://schemas.microsoft.com/office/drawing/2016/5/10/chartex" xmlns:cx5="http://schemas.microsoft.com/office/drawing/2016/5/11/chartex" xmlns:cx6="http://schemas.microsoft.com/office/drawing/2016/5/12/chartex" xmlns:cx7="http://schemas.microsoft.com/office/drawing/2016/5/13/chartex" xmlns:cx8="http://schemas.microsoft.com/office/drawing/2016/5/14/chartex" xmlns:mc="http://schemas.openxmlformats.org/markup-compatibility/2006" xmlns:aink="http://schemas.microsoft.com/office/drawing/2016/ink" xmlns:am3d="http://schemas.microsoft.com/office/drawing/2017/model3d" xmlns:o="urn:schemas-microsoft-com:office:office" xmlns:oel="http://schemas.microsoft.com/office/2019/extlst" xmlns:r="http://schemas.openxmlformats.org/officeDocument/2006/relationships" xmlns:m="http://schemas.openxmlformats.org/officeDocument/2006/math" xmlns:v="urn:schemas-microsoft-com:vml" xmlns:wp14="http://schemas.microsoft.com/office/word/2010/wordprocessingDrawing" xmlns:wp="http://schemas.openxmlformats.org/drawingml/2006/wordprocessingDrawing" xmlns:w10="urn:schemas-microsoft-com:office:word" xmlns:w="http://schemas.openxmlformats.org/wordprocessingml/2006/main" xmlns:w14="http://schemas.microsoft.com/office/word/2010/wordml" xmlns:w15="http://schemas.microsoft.com/office/word/2012/wordml" xmlns:w16cei="http://schemas.microsoft.com/office/word/2026/wordml/cei" xmlns:w16cex="http://schemas.microsoft.com/office/word/2018/wordml/cex" xmlns:w16cid="http://schemas.microsoft.com/office/word/2016/wordml/cid" xmlns:w16="http://schemas.microsoft.com/office/word/2018/wordml" xmlns:w16du="http://schemas.microsoft.com/office/word/2023/wordml/word16du" xmlns:w16sdtdh="http://schemas.microsoft.com/office/word/2020/wordml/sdtdatahash" xmlns:w16sdtfl="http://schemas.microsoft.com/office/word/2024/wordml/sdtformatlock" xmlns:w16se="http://schemas.microsoft.com/office/word/2015/wordml/symex" xmlns:wpg="http://schemas.microsoft.com/office/word/2010/wordprocessingGroup" xmlns:wpi="http://schemas.microsoft.com/office/word/2010/wordprocessingInk" xmlns:wne="http://schemas.microsoft.com/office/word/2006/wordml" xmlns:wps="http://schemas.microsoft.com/office/word/2010/wordprocessingShape" mc:Ignorable="w14 w15 w16se w16cid w16 w16cex w16sdtdh w16sdtfl w16du wp14">
   <w:footnote w:type="separator" w:id="-1">
     <w:p>
       <w:pPr>
@@ -24854,7 +25856,7 @@
 </file>
 
 <file path=word/header1.xml><?xml version="1.0" encoding="utf-8"?>
-<w:hdr xmlns:wpc="http://schemas.microsoft.com/office/word/2010/wordprocessingCanvas" xmlns:cx="http://schemas.microsoft.com/office/drawing/2014/chartex" xmlns:cx1="http://schemas.microsoft.com/office/drawing/2015/9/8/chartex" xmlns:cx2="http://schemas.microsoft.com/office/drawing/2015/10/21/chartex" xmlns:cx3="http://schemas.microsoft.com/office/drawing/2016/5/9/chartex" xmlns:cx4="http://schemas.microsoft.com/office/drawing/2016/5/10/chartex" xmlns:cx5="http://schemas.microsoft.com/office/drawing/2016/5/11/chartex" xmlns:cx6="http://schemas.microsoft.com/office/drawing/2016/5/12/chartex" xmlns:cx7="http://schemas.microsoft.com/office/drawing/2016/5/13/chartex" xmlns:cx8="http://schemas.microsoft.com/office/drawing/2016/5/14/chartex" xmlns:mc="http://schemas.openxmlformats.org/markup-compatibility/2006" xmlns:aink="http://schemas.microsoft.com/office/drawing/2016/ink" xmlns:am3d="http://schemas.microsoft.com/office/drawing/2017/model3d" xmlns:o="urn:schemas-microsoft-com:office:office" xmlns:oel="http://schemas.microsoft.com/office/2019/extlst" xmlns:r="http://schemas.openxmlformats.org/officeDocument/2006/relationships" xmlns:m="http://schemas.openxmlformats.org/officeDocument/2006/math" xmlns:v="urn:schemas-microsoft-com:vml" xmlns:wp14="http://schemas.microsoft.com/office/word/2010/wordprocessingDrawing" xmlns:wp="http://schemas.openxmlformats.org/drawingml/2006/wordprocessingDrawing" xmlns:w10="urn:schemas-microsoft-com:office:word" xmlns:w="http://schemas.openxmlformats.org/wordprocessingml/2006/main" xmlns:w14="http://schemas.microsoft.com/office/word/2010/wordml" xmlns:w15="http://schemas.microsoft.com/office/word/2012/wordml" xmlns:w16cex="http://schemas.microsoft.com/office/word/2018/wordml/cex" xmlns:w16cid="http://schemas.microsoft.com/office/word/2016/wordml/cid" xmlns:w16="http://schemas.microsoft.com/office/word/2018/wordml" xmlns:w16du="http://schemas.microsoft.com/office/word/2023/wordml/word16du" xmlns:w16sdtdh="http://schemas.microsoft.com/office/word/2020/wordml/sdtdatahash" xmlns:w16sdtfl="http://schemas.microsoft.com/office/word/2024/wordml/sdtformatlock" xmlns:w16se="http://schemas.microsoft.com/office/word/2015/wordml/symex" xmlns:wpg="http://schemas.microsoft.com/office/word/2010/wordprocessingGroup" xmlns:wpi="http://schemas.microsoft.com/office/word/2010/wordprocessingInk" xmlns:wne="http://schemas.microsoft.com/office/word/2006/wordml" xmlns:wps="http://schemas.microsoft.com/office/word/2010/wordprocessingShape" mc:Ignorable="w14 w15 w16se w16cid w16 w16cex w16sdtdh w16sdtfl w16du wp14">
+<w:hdr xmlns:wpc="http://schemas.microsoft.com/office/word/2010/wordprocessingCanvas" xmlns:cx="http://schemas.microsoft.com/office/drawing/2014/chartex" xmlns:cx1="http://schemas.microsoft.com/office/drawing/2015/9/8/chartex" xmlns:cx2="http://schemas.microsoft.com/office/drawing/2015/10/21/chartex" xmlns:cx3="http://schemas.microsoft.com/office/drawing/2016/5/9/chartex" xmlns:cx4="http://schemas.microsoft.com/office/drawing/2016/5/10/chartex" xmlns:cx5="http://schemas.microsoft.com/office/drawing/2016/5/11/chartex" xmlns:cx6="http://schemas.microsoft.com/office/drawing/2016/5/12/chartex" xmlns:cx7="http://schemas.microsoft.com/office/drawing/2016/5/13/chartex" xmlns:cx8="http://schemas.microsoft.com/office/drawing/2016/5/14/chartex" xmlns:mc="http://schemas.openxmlformats.org/markup-compatibility/2006" xmlns:aink="http://schemas.microsoft.com/office/drawing/2016/ink" xmlns:am3d="http://schemas.microsoft.com/office/drawing/2017/model3d" xmlns:o="urn:schemas-microsoft-com:office:office" xmlns:oel="http://schemas.microsoft.com/office/2019/extlst" xmlns:r="http://schemas.openxmlformats.org/officeDocument/2006/relationships" xmlns:m="http://schemas.openxmlformats.org/officeDocument/2006/math" xmlns:v="urn:schemas-microsoft-com:vml" xmlns:wp14="http://schemas.microsoft.com/office/word/2010/wordprocessingDrawing" xmlns:wp="http://schemas.openxmlformats.org/drawingml/2006/wordprocessingDrawing" xmlns:w10="urn:schemas-microsoft-com:office:word" xmlns:w="http://schemas.openxmlformats.org/wordprocessingml/2006/main" xmlns:w14="http://schemas.microsoft.com/office/word/2010/wordml" xmlns:w15="http://schemas.microsoft.com/office/word/2012/wordml" xmlns:w16cei="http://schemas.microsoft.com/office/word/2026/wordml/cei" xmlns:w16cex="http://schemas.microsoft.com/office/word/2018/wordml/cex" xmlns:w16cid="http://schemas.microsoft.com/office/word/2016/wordml/cid" xmlns:w16="http://schemas.microsoft.com/office/word/2018/wordml" xmlns:w16du="http://schemas.microsoft.com/office/word/2023/wordml/word16du" xmlns:w16sdtdh="http://schemas.microsoft.com/office/word/2020/wordml/sdtdatahash" xmlns:w16sdtfl="http://schemas.microsoft.com/office/word/2024/wordml/sdtformatlock" xmlns:w16se="http://schemas.microsoft.com/office/word/2015/wordml/symex" xmlns:wpg="http://schemas.microsoft.com/office/word/2010/wordprocessingGroup" xmlns:wpi="http://schemas.microsoft.com/office/word/2010/wordprocessingInk" xmlns:wne="http://schemas.microsoft.com/office/word/2006/wordml" xmlns:wps="http://schemas.microsoft.com/office/word/2010/wordprocessingShape" mc:Ignorable="w14 w15 w16se w16cid w16 w16cex w16sdtdh w16sdtfl w16du wp14">
   <w:p>
     <w:pPr>
       <w:pStyle w:val="Header"/>
@@ -24875,7 +25877,7 @@
 </file>
 
 <file path=word/header2.xml><?xml version="1.0" encoding="utf-8"?>
-<w:hdr xmlns:wpc="http://schemas.microsoft.com/office/word/2010/wordprocessingCanvas" xmlns:cx="http://schemas.microsoft.com/office/drawing/2014/chartex" xmlns:cx1="http://schemas.microsoft.com/office/drawing/2015/9/8/chartex" xmlns:cx2="http://schemas.microsoft.com/office/drawing/2015/10/21/chartex" xmlns:cx3="http://schemas.microsoft.com/office/drawing/2016/5/9/chartex" xmlns:cx4="http://schemas.microsoft.com/office/drawing/2016/5/10/chartex" xmlns:cx5="http://schemas.microsoft.com/office/drawing/2016/5/11/chartex" xmlns:cx6="http://schemas.microsoft.com/office/drawing/2016/5/12/chartex" xmlns:cx7="http://schemas.microsoft.com/office/drawing/2016/5/13/chartex" xmlns:cx8="http://schemas.microsoft.com/office/drawing/2016/5/14/chartex" xmlns:mc="http://schemas.openxmlformats.org/markup-compatibility/2006" xmlns:aink="http://schemas.microsoft.com/office/drawing/2016/ink" xmlns:am3d="http://schemas.microsoft.com/office/drawing/2017/model3d" xmlns:o="urn:schemas-microsoft-com:office:office" xmlns:oel="http://schemas.microsoft.com/office/2019/extlst" xmlns:r="http://schemas.openxmlformats.org/officeDocument/2006/relationships" xmlns:m="http://schemas.openxmlformats.org/officeDocument/2006/math" xmlns:v="urn:schemas-microsoft-com:vml" xmlns:wp14="http://schemas.microsoft.com/office/word/2010/wordprocessingDrawing" xmlns:wp="http://schemas.openxmlformats.org/drawingml/2006/wordprocessingDrawing" xmlns:w10="urn:schemas-microsoft-com:office:word" xmlns:w="http://schemas.openxmlformats.org/wordprocessingml/2006/main" xmlns:w14="http://schemas.microsoft.com/office/word/2010/wordml" xmlns:w15="http://schemas.microsoft.com/office/word/2012/wordml" xmlns:w16cex="http://schemas.microsoft.com/office/word/2018/wordml/cex" xmlns:w16cid="http://schemas.microsoft.com/office/word/2016/wordml/cid" xmlns:w16="http://schemas.microsoft.com/office/word/2018/wordml" xmlns:w16du="http://schemas.microsoft.com/office/word/2023/wordml/word16du" xmlns:w16sdtdh="http://schemas.microsoft.com/office/word/2020/wordml/sdtdatahash" xmlns:w16sdtfl="http://schemas.microsoft.com/office/word/2024/wordml/sdtformatlock" xmlns:w16se="http://schemas.microsoft.com/office/word/2015/wordml/symex" xmlns:wpg="http://schemas.microsoft.com/office/word/2010/wordprocessingGroup" xmlns:wpi="http://schemas.microsoft.com/office/word/2010/wordprocessingInk" xmlns:wne="http://schemas.microsoft.com/office/word/2006/wordml" xmlns:wps="http://schemas.microsoft.com/office/word/2010/wordprocessingShape" mc:Ignorable="w14 w15 w16se w16cid w16 w16cex w16sdtdh w16sdtfl w16du wp14">
+<w:hdr xmlns:wpc="http://schemas.microsoft.com/office/word/2010/wordprocessingCanvas" xmlns:cx="http://schemas.microsoft.com/office/drawing/2014/chartex" xmlns:cx1="http://schemas.microsoft.com/office/drawing/2015/9/8/chartex" xmlns:cx2="http://schemas.microsoft.com/office/drawing/2015/10/21/chartex" xmlns:cx3="http://schemas.microsoft.com/office/drawing/2016/5/9/chartex" xmlns:cx4="http://schemas.microsoft.com/office/drawing/2016/5/10/chartex" xmlns:cx5="http://schemas.microsoft.com/office/drawing/2016/5/11/chartex" xmlns:cx6="http://schemas.microsoft.com/office/drawing/2016/5/12/chartex" xmlns:cx7="http://schemas.microsoft.com/office/drawing/2016/5/13/chartex" xmlns:cx8="http://schemas.microsoft.com/office/drawing/2016/5/14/chartex" xmlns:mc="http://schemas.openxmlformats.org/markup-compatibility/2006" xmlns:aink="http://schemas.microsoft.com/office/drawing/2016/ink" xmlns:am3d="http://schemas.microsoft.com/office/drawing/2017/model3d" xmlns:o="urn:schemas-microsoft-com:office:office" xmlns:oel="http://schemas.microsoft.com/office/2019/extlst" xmlns:r="http://schemas.openxmlformats.org/officeDocument/2006/relationships" xmlns:m="http://schemas.openxmlformats.org/officeDocument/2006/math" xmlns:v="urn:schemas-microsoft-com:vml" xmlns:wp14="http://schemas.microsoft.com/office/word/2010/wordprocessingDrawing" xmlns:wp="http://schemas.openxmlformats.org/drawingml/2006/wordprocessingDrawing" xmlns:w10="urn:schemas-microsoft-com:office:word" xmlns:w="http://schemas.openxmlformats.org/wordprocessingml/2006/main" xmlns:w14="http://schemas.microsoft.com/office/word/2010/wordml" xmlns:w15="http://schemas.microsoft.com/office/word/2012/wordml" xmlns:w16cei="http://schemas.microsoft.com/office/word/2026/wordml/cei" xmlns:w16cex="http://schemas.microsoft.com/office/word/2018/wordml/cex" xmlns:w16cid="http://schemas.microsoft.com/office/word/2016/wordml/cid" xmlns:w16="http://schemas.microsoft.com/office/word/2018/wordml" xmlns:w16du="http://schemas.microsoft.com/office/word/2023/wordml/word16du" xmlns:w16sdtdh="http://schemas.microsoft.com/office/word/2020/wordml/sdtdatahash" xmlns:w16sdtfl="http://schemas.microsoft.com/office/word/2024/wordml/sdtformatlock" xmlns:w16se="http://schemas.microsoft.com/office/word/2015/wordml/symex" xmlns:wpg="http://schemas.microsoft.com/office/word/2010/wordprocessingGroup" xmlns:wpi="http://schemas.microsoft.com/office/word/2010/wordprocessingInk" xmlns:wne="http://schemas.microsoft.com/office/word/2006/wordml" xmlns:wps="http://schemas.microsoft.com/office/word/2010/wordprocessingShape" mc:Ignorable="w14 w15 w16se w16cid w16 w16cex w16sdtdh w16sdtfl w16du wp14">
   <w:p>
     <w:pPr>
       <w:pStyle w:val="Header"/>

</xml_diff>